<commit_message>
Actualiza documento Word de la Plataforma de Comercio de Energia
</commit_message>
<xml_diff>
--- a/plataforma-Comercio-Energia.docx
+++ b/plataforma-Comercio-Energia.docx
@@ -739,7 +739,7 @@
           <w:iCs/>
           <w:lang w:val="es-CO"/>
         </w:rPr>
-        <w:t>Funcionamiento del Patrón Singleton desde la Plataforma</w:t>
+        <w:t>Justificación de su Uso en el Proyecto</w:t>
       </w:r>
       <w:r>
         <w:rPr>
@@ -754,7 +754,7 @@
         <w:rPr>
           <w:lang w:val="es-CO"/>
         </w:rPr>
-        <w:instrText>PAGEREF bm_singleton_funcionamiento \h</w:instrText>
+        <w:instrText>PAGEREF bm_singleton_justificacion \h</w:instrText>
       </w:r>
       <w:r>
         <w:fldChar w:fldCharType="separate"/>
@@ -787,6 +787,54 @@
           <w:iCs/>
           <w:lang w:val="es-CO"/>
         </w:rPr>
+        <w:t>Funcionamiento del Patrón Singleton desde la Plataforma</w:t>
+      </w:r>
+      <w:r>
+        <w:rPr>
+          <w:lang w:val="es-CO"/>
+        </w:rPr>
+        <w:tab/>
+      </w:r>
+      <w:r>
+        <w:fldChar w:fldCharType="begin"/>
+      </w:r>
+      <w:r>
+        <w:rPr>
+          <w:lang w:val="es-CO"/>
+        </w:rPr>
+        <w:instrText>PAGEREF bm_singleton_funcionamiento \h</w:instrText>
+      </w:r>
+      <w:r>
+        <w:fldChar w:fldCharType="separate"/>
+      </w:r>
+      <w:r>
+        <w:rPr>
+          <w:noProof/>
+          <w:lang w:val="es-CO"/>
+        </w:rPr>
+        <w:t>1</w:t>
+      </w:r>
+      <w:r>
+        <w:fldChar w:fldCharType="end"/>
+      </w:r>
+    </w:p>
+    <w:p>
+      <w:pPr>
+        <w:tabs>
+          <w:tab w:val="right" w:leader="dot" w:pos="9360"/>
+        </w:tabs>
+        <w:spacing w:after="80" w:line="360" w:lineRule="auto"/>
+        <w:ind w:left="720"/>
+        <w:rPr>
+          <w:lang w:val="es-CO"/>
+        </w:rPr>
+      </w:pPr>
+      <w:r>
+        <w:rPr>
+          <w:i/>
+          <w:iCs/>
+          <w:lang w:val="es-CO"/>
+        </w:rPr>
         <w:t>Validación del Patrón</w:t>
       </w:r>
       <w:r>
@@ -1039,7 +1087,7 @@
           <w:iCs/>
           <w:lang w:val="es-CO"/>
         </w:rPr>
-        <w:t>Validación del Patrón</w:t>
+        <w:t>Justificación de su Uso en el Proyecto</w:t>
       </w:r>
       <w:r>
         <w:rPr>
@@ -1054,7 +1102,7 @@
         <w:rPr>
           <w:lang w:val="es-CO"/>
         </w:rPr>
-        <w:instrText>PAGEREF bm_factory_validacion \h</w:instrText>
+        <w:instrText>PAGEREF bm_factory_justificacion \h</w:instrText>
       </w:r>
       <w:r>
         <w:fldChar w:fldCharType="separate"/>
@@ -1087,6 +1135,54 @@
           <w:iCs/>
           <w:lang w:val="es-CO"/>
         </w:rPr>
+        <w:t>Validación del Patrón</w:t>
+      </w:r>
+      <w:r>
+        <w:rPr>
+          <w:lang w:val="es-CO"/>
+        </w:rPr>
+        <w:tab/>
+      </w:r>
+      <w:r>
+        <w:fldChar w:fldCharType="begin"/>
+      </w:r>
+      <w:r>
+        <w:rPr>
+          <w:lang w:val="es-CO"/>
+        </w:rPr>
+        <w:instrText>PAGEREF bm_factory_validacion \h</w:instrText>
+      </w:r>
+      <w:r>
+        <w:fldChar w:fldCharType="separate"/>
+      </w:r>
+      <w:r>
+        <w:rPr>
+          <w:noProof/>
+          <w:lang w:val="es-CO"/>
+        </w:rPr>
+        <w:t>1</w:t>
+      </w:r>
+      <w:r>
+        <w:fldChar w:fldCharType="end"/>
+      </w:r>
+    </w:p>
+    <w:p>
+      <w:pPr>
+        <w:tabs>
+          <w:tab w:val="right" w:leader="dot" w:pos="9360"/>
+        </w:tabs>
+        <w:spacing w:after="80" w:line="360" w:lineRule="auto"/>
+        <w:ind w:left="720"/>
+        <w:rPr>
+          <w:lang w:val="es-CO"/>
+        </w:rPr>
+      </w:pPr>
+      <w:r>
+        <w:rPr>
+          <w:i/>
+          <w:iCs/>
+          <w:lang w:val="es-CO"/>
+        </w:rPr>
         <w:t>Conclusión</w:t>
       </w:r>
       <w:r>
@@ -1758,12 +1854,6 @@
         <w:spacing w:before="240" w:after="240" w:line="480" w:lineRule="auto"/>
         <w:jc w:val="center"/>
         <w:rPr>
-          <w:lang w:val="es-CO"/>
-        </w:rPr>
-      </w:pPr>
-      <w:bookmarkStart w:id="0" w:name="bm_titulo"/>
-      <w:r>
-        <w:rPr>
           <w:b/>
           <w:bCs/>
           <w:color w:val="000000"/>
@@ -1771,19 +1861,8 @@
           <w:szCs w:val="24"/>
           <w:lang w:val="es-CO"/>
         </w:rPr>
-        <w:t>Plataforma de Comercio de Energía</w:t>
-      </w:r>
-      <w:bookmarkEnd w:id="0"/>
-    </w:p>
-    <w:p>
-      <w:pPr>
-        <w:pStyle w:val="Ttulo2"/>
-        <w:spacing w:before="240" w:after="120" w:line="480" w:lineRule="auto"/>
-        <w:rPr>
-          <w:lang w:val="es-CO"/>
-        </w:rPr>
-      </w:pPr>
-      <w:bookmarkStart w:id="1" w:name="bm_contextualizacion"/>
+      </w:pPr>
+      <w:bookmarkStart w:id="0" w:name="bm_titulo"/>
       <w:r>
         <w:rPr>
           <w:b/>
@@ -1793,6 +1872,38 @@
           <w:szCs w:val="24"/>
           <w:lang w:val="es-CO"/>
         </w:rPr>
+        <w:t xml:space="preserve">Plataforma de Comercio de Energía: </w:t>
+      </w:r>
+      <w:bookmarkEnd w:id="0"/>
+    </w:p>
+    <w:p>
+      <w:pPr>
+        <w:pStyle w:val="Ttulo1"/>
+        <w:spacing w:before="240" w:after="240" w:line="480" w:lineRule="auto"/>
+        <w:jc w:val="center"/>
+        <w:rPr>
+          <w:lang w:val="es-CO"/>
+        </w:rPr>
+      </w:pPr>
+    </w:p>
+    <w:p>
+      <w:pPr>
+        <w:pStyle w:val="Ttulo2"/>
+        <w:spacing w:before="240" w:after="120" w:line="480" w:lineRule="auto"/>
+        <w:rPr>
+          <w:lang w:val="es-CO"/>
+        </w:rPr>
+      </w:pPr>
+      <w:bookmarkStart w:id="1" w:name="bm_contextualizacion"/>
+      <w:r>
+        <w:rPr>
+          <w:b/>
+          <w:bCs/>
+          <w:color w:val="000000"/>
+          <w:sz w:val="24"/>
+          <w:szCs w:val="24"/>
+          <w:lang w:val="es-CO"/>
+        </w:rPr>
         <w:t>Contextualización del Proyecto</w:t>
       </w:r>
       <w:bookmarkEnd w:id="1"/>
@@ -1899,7 +2010,14 @@
         <w:rPr>
           <w:lang w:val="es-CO"/>
         </w:rPr>
-        <w:t xml:space="preserve">El crecimiento de las energías renovables ha permitido que los hogares y pequeñas empresas generen parte de la energía que consumen. Sin embargo, todavía existen dificultades para administrar, monitorear y comercializar los excedentes energéticos. </w:t>
+        <w:t xml:space="preserve">El crecimiento de las energías renovables ha permitido que los hogares y pequeñas empresas generen parte de la energía que consumen. Sin embargo, todavía </w:t>
+      </w:r>
+      <w:r>
+        <w:rPr>
+          <w:lang w:val="es-CO"/>
+        </w:rPr>
+        <w:lastRenderedPageBreak/>
+        <w:t xml:space="preserve">existen dificultades para administrar, monitorear y comercializar los excedentes energéticos. </w:t>
       </w:r>
       <w:r>
         <w:t xml:space="preserve">Entre </w:t>
@@ -1953,7 +2071,6 @@
         <w:rPr>
           <w:lang w:val="es-CO"/>
         </w:rPr>
-        <w:lastRenderedPageBreak/>
         <w:t>Desaprovechamiento de la energía sobrante.</w:t>
       </w:r>
     </w:p>
@@ -2265,6 +2382,7 @@
         <w:rPr>
           <w:lang w:val="es-CO"/>
         </w:rPr>
+        <w:lastRenderedPageBreak/>
         <w:t>Monitoreo de producción y consumo energético.</w:t>
       </w:r>
     </w:p>
@@ -2298,7 +2416,6 @@
       </w:pPr>
       <w:proofErr w:type="spellStart"/>
       <w:r>
-        <w:lastRenderedPageBreak/>
         <w:t>Predicción</w:t>
       </w:r>
       <w:proofErr w:type="spellEnd"/>
@@ -2516,7 +2633,14 @@
         <w:rPr>
           <w:lang w:val="es-CO"/>
         </w:rPr>
-        <w:t xml:space="preserve">El patrón Singleton aplicado en el proyecto garantiza que las operaciones que se requieran realizar se ejecuten sin importar quién las solicite, ni cuántas veces las solicite, ni cuántas solicitudes lleguen al mismo tiempo, ya que todas se ejecutan sobre el mismo espacio de memoria. Este módulo forma parte de la lógica de dominio del sistema y es consumido por la API construida con </w:t>
+        <w:t xml:space="preserve">El patrón Singleton aplicado en el proyecto garantiza que las operaciones que se requieran realizar se ejecuten sin importar quién las solicite, ni cuántas veces las solicite, ni cuántas solicitudes lleguen al mismo tiempo, ya que todas se ejecutan sobre el mismo </w:t>
+      </w:r>
+      <w:r>
+        <w:rPr>
+          <w:lang w:val="es-CO"/>
+        </w:rPr>
+        <w:lastRenderedPageBreak/>
+        <w:t xml:space="preserve">espacio de memoria. Este módulo forma parte de la lógica de dominio del sistema y es consumido por la API construida con </w:t>
       </w:r>
       <w:proofErr w:type="spellStart"/>
       <w:r>
@@ -2551,7 +2675,6 @@
           <w:color w:val="000000"/>
           <w:lang w:val="es-CO"/>
         </w:rPr>
-        <w:lastRenderedPageBreak/>
         <w:t>Código del Patrón Singleton</w:t>
       </w:r>
       <w:bookmarkEnd w:id="9"/>
@@ -4050,6 +4173,7 @@
         <w:rPr>
           <w:lang w:val="es-CO"/>
         </w:rPr>
+        <w:lastRenderedPageBreak/>
         <w:t xml:space="preserve">La </w:t>
       </w:r>
       <w:proofErr w:type="spellStart"/>
@@ -4120,14 +4244,7 @@
         <w:rPr>
           <w:lang w:val="es-CO"/>
         </w:rPr>
-        <w:t xml:space="preserve">: si ya existe una instancia almacenada, la devuelve directamente; si no existe, la crea una única vez dentro de un bloque protegido por un </w:t>
-      </w:r>
-      <w:r>
-        <w:rPr>
-          <w:lang w:val="es-CO"/>
-        </w:rPr>
-        <w:lastRenderedPageBreak/>
-        <w:t>Lock, lo que evita que dos hilos concurrentes generen dos instancias distintas del mismo objeto (véase Figura 1).</w:t>
+        <w:t>: si ya existe una instancia almacenada, la devuelve directamente; si no existe, la crea una única vez dentro de un bloque protegido por un Lock, lo que evita que dos hilos concurrentes generen dos instancias distintas del mismo objeto (véase Figura 1).</w:t>
       </w:r>
     </w:p>
     <w:p>
@@ -4351,6 +4468,7 @@
         <w:rPr>
           <w:lang w:val="es-CO"/>
         </w:rPr>
+        <w:lastRenderedPageBreak/>
         <w:t xml:space="preserve">Como limitación conocida, el estado del sistema se pierde si el proceso se reinicia y el patrón, tal como está implementado, no escala a múltiples procesos o </w:t>
       </w:r>
       <w:proofErr w:type="spellStart"/>
@@ -4365,14 +4483,7 @@
         <w:rPr>
           <w:lang w:val="es-CO"/>
         </w:rPr>
-        <w:t xml:space="preserve">, ya que cada uno mantendría su propio Singleton independiente. Esta limitación es aceptable </w:t>
-      </w:r>
-      <w:r>
-        <w:rPr>
-          <w:lang w:val="es-CO"/>
-        </w:rPr>
-        <w:lastRenderedPageBreak/>
-        <w:t>para el prototipo actual, pero constituye el primer aspecto a resolver si el proyecto migra hacia una base de datos real.</w:t>
+        <w:t>, ya que cada uno mantendría su propio Singleton independiente. Esta limitación es aceptable para el prototipo actual, pero constituye el primer aspecto a resolver si el proyecto migra hacia una base de datos real.</w:t>
       </w:r>
     </w:p>
     <w:p>
@@ -4383,7 +4494,7 @@
           <w:lang w:val="es-CO"/>
         </w:rPr>
       </w:pPr>
-      <w:bookmarkStart w:id="12" w:name="bm_singleton_funcionamiento"/>
+      <w:bookmarkStart w:id="12" w:name="bm_singleton_justificacion"/>
       <w:r>
         <w:rPr>
           <w:b/>
@@ -4393,7 +4504,7 @@
           <w:color w:val="000000"/>
           <w:lang w:val="es-CO"/>
         </w:rPr>
-        <w:t>Funcionamiento del Patrón Singleton desde la Plataforma</w:t>
+        <w:t>Justificación de su Uso en el Proyecto</w:t>
       </w:r>
       <w:bookmarkEnd w:id="12"/>
     </w:p>
@@ -4410,7 +4521,21 @@
         <w:rPr>
           <w:lang w:val="es-CO"/>
         </w:rPr>
-        <w:t xml:space="preserve">A continuación, se presenta la evidencia del funcionamiento del patrón Singleton observado directamente en la plataforma en ejecución, mostrando cómo distintas operaciones son atendidas por la misma instancia compartida de </w:t>
+        <w:t xml:space="preserve">El patrón Singleton resulta especialmente útil para este proyecto porque la Plataforma de Comercio de Energía debe coordinar, en tiempo real, las órdenes de compra y venta, las lecturas de los dispositivos </w:t>
+      </w:r>
+      <w:proofErr w:type="spellStart"/>
+      <w:r>
+        <w:rPr>
+          <w:lang w:val="es-CO"/>
+        </w:rPr>
+        <w:t>IoT</w:t>
+      </w:r>
+      <w:proofErr w:type="spellEnd"/>
+      <w:r>
+        <w:rPr>
+          <w:lang w:val="es-CO"/>
+        </w:rPr>
+        <w:t xml:space="preserve"> y la ejecución de la subasta que publican múltiples usuarios de manera simultánea. Si cada solicitud HTTP pudiera operar sobre una instancia distinta del dominio, el libro de órdenes, el historial de transacciones y los saldos de los usuarios se desincronizarían entre sí, lo que haría inviable un mercado energético confiable. Al garantizar una única instancia de </w:t>
       </w:r>
       <w:proofErr w:type="spellStart"/>
       <w:r>
@@ -4424,58 +4549,139 @@
         <w:rPr>
           <w:lang w:val="es-CO"/>
         </w:rPr>
-        <w:t>.</w:t>
-      </w:r>
-    </w:p>
-    <w:p>
-      <w:pPr>
-        <w:spacing w:before="200" w:line="480" w:lineRule="auto"/>
-        <w:rPr>
-          <w:lang w:val="es-CO"/>
-        </w:rPr>
-      </w:pPr>
-      <w:bookmarkStart w:id="13" w:name="bm_fig2"/>
+        <w:t xml:space="preserve"> compartida por toda la API, el Singleton asegura que todas las operaciones descritas en la Contextualización del Proyecto (publicación de excedentes, ofertas de compra, ejecución de subastas y monitoreo de dispositivos </w:t>
+      </w:r>
+      <w:proofErr w:type="spellStart"/>
+      <w:r>
+        <w:rPr>
+          <w:lang w:val="es-CO"/>
+        </w:rPr>
+        <w:t>IoT</w:t>
+      </w:r>
+      <w:proofErr w:type="spellEnd"/>
+      <w:r>
+        <w:rPr>
+          <w:lang w:val="es-CO"/>
+        </w:rPr>
+        <w:t xml:space="preserve">) se resuelvan siempre sobre el mismo estado consistente, sin necesidad de introducir una base de datos externa en esta etapa de prototipo. Adicionalmente, dado que la plataforma debe atender solicitudes concurrentes (varios usuarios operando y dispositivos enviando lecturas al mismo tiempo), el mecanismo de bloqueo (Lock) incorporado en la </w:t>
+      </w:r>
+      <w:proofErr w:type="spellStart"/>
+      <w:r>
+        <w:rPr>
+          <w:lang w:val="es-CO"/>
+        </w:rPr>
+        <w:t>metaclase</w:t>
+      </w:r>
+      <w:proofErr w:type="spellEnd"/>
+      <w:r>
+        <w:rPr>
+          <w:lang w:val="es-CO"/>
+        </w:rPr>
+        <w:t xml:space="preserve"> evita condiciones de carrera que podrían comprometer la integridad de las transacciones energéticas.</w:t>
+      </w:r>
+    </w:p>
+    <w:p>
+      <w:pPr>
+        <w:pStyle w:val="Ttulo3"/>
+        <w:spacing w:before="200" w:after="100" w:line="480" w:lineRule="auto"/>
+        <w:rPr>
+          <w:lang w:val="es-CO"/>
+        </w:rPr>
+      </w:pPr>
+      <w:bookmarkStart w:id="13" w:name="bm_singleton_funcionamiento"/>
       <w:r>
         <w:rPr>
           <w:b/>
           <w:bCs/>
-          <w:lang w:val="es-CO"/>
-        </w:rPr>
-        <w:t>Figura 2</w:t>
-      </w:r>
-      <w:bookmarkEnd w:id="13"/>
-    </w:p>
-    <w:p>
-      <w:pPr>
-        <w:spacing w:line="480" w:lineRule="auto"/>
-        <w:rPr>
-          <w:lang w:val="es-CO"/>
-        </w:rPr>
-      </w:pPr>
-      <w:r>
-        <w:rPr>
           <w:i/>
           <w:iCs/>
-          <w:lang w:val="es-CO"/>
-        </w:rPr>
-        <w:t xml:space="preserve">Plataforma </w:t>
-      </w:r>
-      <w:proofErr w:type="spellStart"/>
+          <w:color w:val="000000"/>
+          <w:lang w:val="es-CO"/>
+        </w:rPr>
+        <w:t>Funcionamiento del Patrón Singleton desde la Plataforma</w:t>
+      </w:r>
+      <w:bookmarkEnd w:id="13"/>
+    </w:p>
+    <w:p>
+      <w:pPr>
+        <w:spacing w:line="480" w:lineRule="auto"/>
+        <w:ind w:firstLine="720"/>
+        <w:jc w:val="both"/>
+        <w:rPr>
+          <w:lang w:val="es-CO"/>
+        </w:rPr>
+      </w:pPr>
+      <w:r>
+        <w:rPr>
+          <w:lang w:val="es-CO"/>
+        </w:rPr>
+        <w:lastRenderedPageBreak/>
+        <w:t xml:space="preserve">A continuación, se presenta la evidencia del funcionamiento del patrón Singleton observado directamente en la plataforma en ejecución, mostrando cómo distintas operaciones son atendidas por la misma instancia compartida de </w:t>
+      </w:r>
+      <w:proofErr w:type="spellStart"/>
+      <w:r>
+        <w:rPr>
+          <w:lang w:val="es-CO"/>
+        </w:rPr>
+        <w:t>PlataformaEnergia</w:t>
+      </w:r>
+      <w:proofErr w:type="spellEnd"/>
+      <w:r>
+        <w:rPr>
+          <w:lang w:val="es-CO"/>
+        </w:rPr>
+        <w:t>.</w:t>
+      </w:r>
+    </w:p>
+    <w:p>
+      <w:pPr>
+        <w:spacing w:before="200" w:line="480" w:lineRule="auto"/>
+        <w:rPr>
+          <w:lang w:val="es-CO"/>
+        </w:rPr>
+      </w:pPr>
+      <w:bookmarkStart w:id="14" w:name="bm_fig2"/>
+      <w:r>
+        <w:rPr>
+          <w:b/>
+          <w:bCs/>
+          <w:lang w:val="es-CO"/>
+        </w:rPr>
+        <w:t>Figura 2</w:t>
+      </w:r>
+      <w:bookmarkEnd w:id="14"/>
+    </w:p>
+    <w:p>
+      <w:pPr>
+        <w:spacing w:line="480" w:lineRule="auto"/>
+        <w:rPr>
+          <w:lang w:val="es-CO"/>
+        </w:rPr>
+      </w:pPr>
       <w:r>
         <w:rPr>
           <w:i/>
           <w:iCs/>
           <w:lang w:val="es-CO"/>
         </w:rPr>
-        <w:t>Voltia</w:t>
-      </w:r>
-      <w:proofErr w:type="spellEnd"/>
+        <w:t xml:space="preserve">Plataforma </w:t>
+      </w:r>
+      <w:proofErr w:type="spellStart"/>
       <w:r>
         <w:rPr>
           <w:i/>
           <w:iCs/>
           <w:lang w:val="es-CO"/>
         </w:rPr>
+        <w:t>Voltia</w:t>
+      </w:r>
+      <w:proofErr w:type="spellEnd"/>
+      <w:r>
+        <w:rPr>
+          <w:i/>
+          <w:iCs/>
+          <w:lang w:val="es-CO"/>
+        </w:rPr>
         <w:t xml:space="preserve"> en ejecución, evidenciando el estado compartido gestionado por el Singleton</w:t>
       </w:r>
     </w:p>
@@ -4489,7 +4695,7 @@
           <w:noProof/>
         </w:rPr>
         <w:drawing>
-          <wp:inline distT="0" distB="0" distL="0" distR="0" wp14:anchorId="3C871CE2" wp14:editId="266BD0B0">
+          <wp:inline distT="0" distB="0" distL="0" distR="0" wp14:anchorId="45C3921A" wp14:editId="7AC8D9EA">
             <wp:extent cx="5143500" cy="3657600"/>
             <wp:effectExtent l="0" t="0" r="0" b="0"/>
             <wp:docPr id="1" name="Imagen 1"/>
@@ -4568,7 +4774,6 @@
         <w:rPr>
           <w:lang w:val="es-CO"/>
         </w:rPr>
-        <w:lastRenderedPageBreak/>
         <w:t>PlataformaEnergia</w:t>
       </w:r>
       <w:proofErr w:type="spellEnd"/>
@@ -4592,6 +4797,7 @@
         <w:rPr>
           <w:lang w:val="es-CO"/>
         </w:rPr>
+        <w:lastRenderedPageBreak/>
         <w:t>Por su parte, la Figura 3 confirma que la implementación desplegada en el proyecto corresponde efectivamente al código presentado en la Figura 1.</w:t>
       </w:r>
     </w:p>
@@ -4602,7 +4808,7 @@
           <w:lang w:val="es-CO"/>
         </w:rPr>
       </w:pPr>
-      <w:bookmarkStart w:id="14" w:name="bm_fig3"/>
+      <w:bookmarkStart w:id="15" w:name="bm_fig3"/>
       <w:r>
         <w:rPr>
           <w:b/>
@@ -4611,7 +4817,7 @@
         </w:rPr>
         <w:t>Figura 3</w:t>
       </w:r>
-      <w:bookmarkEnd w:id="14"/>
+      <w:bookmarkEnd w:id="15"/>
     </w:p>
     <w:p>
       <w:pPr>
@@ -4675,10 +4881,10 @@
           <w:noProof/>
         </w:rPr>
         <w:drawing>
-          <wp:inline distT="0" distB="0" distL="0" distR="0" wp14:anchorId="1131A776" wp14:editId="38F22432">
+          <wp:inline distT="0" distB="0" distL="0" distR="0" wp14:anchorId="065CEA7C" wp14:editId="359C4FEB">
             <wp:extent cx="5143500" cy="3209925"/>
             <wp:effectExtent l="0" t="0" r="0" b="0"/>
-            <wp:docPr id="1982099910" name="Imagen 1982099910"/>
+            <wp:docPr id="1369250917" name="Imagen 1369250917"/>
             <wp:cNvGraphicFramePr>
               <a:graphicFrameLocks xmlns:a="http://schemas.openxmlformats.org/drawingml/2006/main" noChangeAspect="1"/>
             </wp:cNvGraphicFramePr>
@@ -4772,7 +4978,7 @@
           <w:lang w:val="es-CO"/>
         </w:rPr>
       </w:pPr>
-      <w:bookmarkStart w:id="15" w:name="bm_singleton_validacion"/>
+      <w:bookmarkStart w:id="16" w:name="bm_singleton_validacion"/>
       <w:r>
         <w:rPr>
           <w:b/>
@@ -4784,7 +4990,7 @@
         </w:rPr>
         <w:t>Validación del Patrón</w:t>
       </w:r>
-      <w:bookmarkEnd w:id="15"/>
+      <w:bookmarkEnd w:id="16"/>
     </w:p>
     <w:p>
       <w:pPr>
@@ -4834,29 +5040,35 @@
         <w:rPr>
           <w:lang w:val="es-CO"/>
         </w:rPr>
+        <w:t>SingletonMeta</w:t>
+      </w:r>
+      <w:proofErr w:type="spellEnd"/>
+      <w:r>
+        <w:rPr>
+          <w:lang w:val="es-CO"/>
+        </w:rPr>
+        <w:t xml:space="preserve"> y de la clase </w:t>
+      </w:r>
+      <w:proofErr w:type="spellStart"/>
+      <w:r>
+        <w:rPr>
+          <w:lang w:val="es-CO"/>
+        </w:rPr>
+        <w:t>PlataformaEnergia</w:t>
+      </w:r>
+      <w:proofErr w:type="spellEnd"/>
+      <w:r>
+        <w:rPr>
+          <w:lang w:val="es-CO"/>
+        </w:rPr>
+        <w:t xml:space="preserve"> se ajusta a lo esperado. Como se observa </w:t>
+      </w:r>
+      <w:r>
+        <w:rPr>
+          <w:lang w:val="es-CO"/>
+        </w:rPr>
         <w:lastRenderedPageBreak/>
-        <w:t>SingletonMeta</w:t>
-      </w:r>
-      <w:proofErr w:type="spellEnd"/>
-      <w:r>
-        <w:rPr>
-          <w:lang w:val="es-CO"/>
-        </w:rPr>
-        <w:t xml:space="preserve"> y de la clase </w:t>
-      </w:r>
-      <w:proofErr w:type="spellStart"/>
-      <w:r>
-        <w:rPr>
-          <w:lang w:val="es-CO"/>
-        </w:rPr>
-        <w:t>PlataformaEnergia</w:t>
-      </w:r>
-      <w:proofErr w:type="spellEnd"/>
-      <w:r>
-        <w:rPr>
-          <w:lang w:val="es-CO"/>
-        </w:rPr>
-        <w:t xml:space="preserve"> se ajusta a lo esperado. Como se observa en la Figura 4, la suite tests/test_singleton.py ejecutó 18 pruebas, todas ellas superadas exitosamente.</w:t>
+        <w:t>en la Figura 4, la suite tests/test_singleton.py ejecutó 18 pruebas, todas ellas superadas exitosamente.</w:t>
       </w:r>
     </w:p>
     <w:p>
@@ -4866,7 +5078,7 @@
           <w:lang w:val="es-CO"/>
         </w:rPr>
       </w:pPr>
-      <w:bookmarkStart w:id="16" w:name="bm_fig4"/>
+      <w:bookmarkStart w:id="17" w:name="bm_fig4"/>
       <w:r>
         <w:rPr>
           <w:b/>
@@ -4875,7 +5087,7 @@
         </w:rPr>
         <w:t>Figura 4</w:t>
       </w:r>
-      <w:bookmarkEnd w:id="16"/>
+      <w:bookmarkEnd w:id="17"/>
     </w:p>
     <w:p>
       <w:pPr>
@@ -4903,10 +5115,10 @@
           <w:noProof/>
         </w:rPr>
         <w:drawing>
-          <wp:inline distT="0" distB="0" distL="0" distR="0" wp14:anchorId="3C637332" wp14:editId="4E47279F">
+          <wp:inline distT="0" distB="0" distL="0" distR="0" wp14:anchorId="48B2BF0A" wp14:editId="0C57C637">
             <wp:extent cx="5486400" cy="2105025"/>
             <wp:effectExtent l="0" t="0" r="0" b="0"/>
-            <wp:docPr id="506376334" name="Imagen 506376334"/>
+            <wp:docPr id="2053151399" name="Imagen 2053151399"/>
             <wp:cNvGraphicFramePr>
               <a:graphicFrameLocks xmlns:a="http://schemas.openxmlformats.org/drawingml/2006/main" noChangeAspect="1"/>
             </wp:cNvGraphicFramePr>
@@ -5061,7 +5273,7 @@
           <w:lang w:val="es-CO"/>
         </w:rPr>
       </w:pPr>
-      <w:bookmarkStart w:id="17" w:name="bm_factory"/>
+      <w:bookmarkStart w:id="18" w:name="bm_factory"/>
       <w:r>
         <w:rPr>
           <w:b/>
@@ -5097,7 +5309,7 @@
         </w:rPr>
         <w:t xml:space="preserve"> Domésticos</w:t>
       </w:r>
-      <w:bookmarkEnd w:id="17"/>
+      <w:bookmarkEnd w:id="18"/>
     </w:p>
     <w:p>
       <w:pPr>
@@ -5137,7 +5349,7 @@
           <w:lang w:val="es-CO"/>
         </w:rPr>
       </w:pPr>
-      <w:bookmarkStart w:id="18" w:name="bm_factory_problema"/>
+      <w:bookmarkStart w:id="19" w:name="bm_factory_problema"/>
       <w:r>
         <w:rPr>
           <w:b/>
@@ -5149,7 +5361,7 @@
         </w:rPr>
         <w:t>El Problema que Resuelve</w:t>
       </w:r>
-      <w:bookmarkEnd w:id="18"/>
+      <w:bookmarkEnd w:id="19"/>
     </w:p>
     <w:p>
       <w:pPr>
@@ -5507,7 +5719,7 @@
           <w:lang w:val="es-CO"/>
         </w:rPr>
       </w:pPr>
-      <w:bookmarkStart w:id="19" w:name="bm_factory_solucion"/>
+      <w:bookmarkStart w:id="20" w:name="bm_factory_solucion"/>
       <w:r>
         <w:rPr>
           <w:b/>
@@ -5519,7 +5731,7 @@
         </w:rPr>
         <w:t>Cómo lo Soluciona el Patrón</w:t>
       </w:r>
-      <w:bookmarkEnd w:id="19"/>
+      <w:bookmarkEnd w:id="20"/>
     </w:p>
     <w:p>
       <w:pPr>
@@ -5900,7 +6112,7 @@
           <w:lang w:val="es-CO"/>
         </w:rPr>
       </w:pPr>
-      <w:bookmarkStart w:id="20" w:name="bm_factory_gana"/>
+      <w:bookmarkStart w:id="21" w:name="bm_factory_gana"/>
       <w:r>
         <w:rPr>
           <w:b/>
@@ -5912,7 +6124,7 @@
         </w:rPr>
         <w:t>Qué Gana la Plataforma con Esto</w:t>
       </w:r>
-      <w:bookmarkEnd w:id="20"/>
+      <w:bookmarkEnd w:id="21"/>
     </w:p>
     <w:p>
       <w:pPr>
@@ -6125,7 +6337,7 @@
           <w:lang w:val="es-CO"/>
         </w:rPr>
       </w:pPr>
-      <w:bookmarkStart w:id="21" w:name="bm_factory_validacion"/>
+      <w:bookmarkStart w:id="22" w:name="bm_factory_justificacion"/>
       <w:r>
         <w:rPr>
           <w:b/>
@@ -6135,9 +6347,9 @@
           <w:color w:val="000000"/>
           <w:lang w:val="es-CO"/>
         </w:rPr>
-        <w:t>Validación del Patrón</w:t>
-      </w:r>
-      <w:bookmarkEnd w:id="21"/>
+        <w:t>Justificación de su Uso en el Proyecto</w:t>
+      </w:r>
+      <w:bookmarkEnd w:id="22"/>
     </w:p>
     <w:p>
       <w:pPr>
@@ -6152,21 +6364,7 @@
         <w:rPr>
           <w:lang w:val="es-CO"/>
         </w:rPr>
-        <w:t xml:space="preserve">La validación del patrón Factory Method se realizó mediante pruebas unitarias automatizadas con </w:t>
-      </w:r>
-      <w:proofErr w:type="spellStart"/>
-      <w:r>
-        <w:rPr>
-          <w:lang w:val="es-CO"/>
-        </w:rPr>
-        <w:t>pytest</w:t>
-      </w:r>
-      <w:proofErr w:type="spellEnd"/>
-      <w:r>
-        <w:rPr>
-          <w:lang w:val="es-CO"/>
-        </w:rPr>
-        <w:t xml:space="preserve">, las cuales verifican que el registro de fábricas y la creación de cada tipo de dispositivo </w:t>
+        <w:t xml:space="preserve">El patrón Factory Method resulta útil para este proyecto porque, según lo planteado en la Contextualización del Proyecto, la plataforma debe integrar distintos tipos de dispositivos </w:t>
       </w:r>
       <w:proofErr w:type="spellStart"/>
       <w:r>
@@ -6180,38 +6378,125 @@
         <w:rPr>
           <w:lang w:val="es-CO"/>
         </w:rPr>
-        <w:t xml:space="preserve"> funcionan correctamente. Como se observa en la Figura 5, la suite tests/test_factory_method.py ejecutó 16 pruebas, todas ellas superadas exitosamente, lo que confirma junto con la validación previa del patrón Singleton que el conjunto completo de pruebas automatizadas del proyecto pasa sin errores.</w:t>
-      </w:r>
-    </w:p>
-    <w:p>
-      <w:pPr>
-        <w:spacing w:before="200" w:line="480" w:lineRule="auto"/>
-        <w:rPr>
-          <w:lang w:val="es-CO"/>
-        </w:rPr>
-      </w:pPr>
-      <w:bookmarkStart w:id="22" w:name="bm_fig5"/>
+        <w:t xml:space="preserve"> domésticos (paneles solares, baterías inteligentes y medidores) y dejar abierta la posibilidad de incorporar nuevos tipos de dispositivos a futuro, como cargadores de vehículos eléctricos u otras fuentes de generación distribuida. Cada tipo de dispositivo genera sus lecturas de kWh de forma distinta, por lo que centralizar esa lógica en condicionales dispersos por el código haría cada vez más difícil mantener y extender la plataforma a medida que crezca el catálogo de dispositivos soportados. Al delegar la creación de cada dispositivo a una fábrica concreta, el Factory Method permite que la API, el módulo de simulación de lecturas y el módulo de predicción trabajen siempre contra la interfaz común </w:t>
+      </w:r>
+      <w:proofErr w:type="spellStart"/>
+      <w:r>
+        <w:rPr>
+          <w:lang w:val="es-CO"/>
+        </w:rPr>
+        <w:t>DispositivoIoT</w:t>
+      </w:r>
+      <w:proofErr w:type="spellEnd"/>
+      <w:r>
+        <w:rPr>
+          <w:lang w:val="es-CO"/>
+        </w:rPr>
+        <w:t>, sin conocer los detalles de cada implementación. Esto es coherente con el impacto esperado del proyecto de servir como base para futuras soluciones relacionadas con redes eléctricas inteligentes y automatización de hogares, ya que permite agregar nuevos tipos de dispositivos sin modificar el código existente, en línea con el principio abierto/cerrado.</w:t>
+      </w:r>
+    </w:p>
+    <w:p>
+      <w:pPr>
+        <w:pStyle w:val="Ttulo3"/>
+        <w:spacing w:before="200" w:after="100" w:line="480" w:lineRule="auto"/>
+        <w:rPr>
+          <w:lang w:val="es-CO"/>
+        </w:rPr>
+      </w:pPr>
+      <w:bookmarkStart w:id="23" w:name="bm_factory_validacion"/>
       <w:r>
         <w:rPr>
           <w:b/>
           <w:bCs/>
-          <w:lang w:val="es-CO"/>
-        </w:rPr>
-        <w:t>Figura 5</w:t>
-      </w:r>
-      <w:bookmarkEnd w:id="22"/>
-    </w:p>
-    <w:p>
-      <w:pPr>
-        <w:spacing w:line="480" w:lineRule="auto"/>
-        <w:rPr>
-          <w:lang w:val="es-CO"/>
-        </w:rPr>
-      </w:pPr>
-      <w:r>
-        <w:rPr>
           <w:i/>
           <w:iCs/>
+          <w:color w:val="000000"/>
+          <w:lang w:val="es-CO"/>
+        </w:rPr>
+        <w:t>Validación del Patrón</w:t>
+      </w:r>
+      <w:bookmarkEnd w:id="23"/>
+    </w:p>
+    <w:p>
+      <w:pPr>
+        <w:spacing w:line="480" w:lineRule="auto"/>
+        <w:ind w:firstLine="720"/>
+        <w:jc w:val="both"/>
+        <w:rPr>
+          <w:lang w:val="es-CO"/>
+        </w:rPr>
+      </w:pPr>
+      <w:r>
+        <w:rPr>
+          <w:lang w:val="es-CO"/>
+        </w:rPr>
+        <w:t xml:space="preserve">La validación del patrón Factory Method se realizó mediante pruebas unitarias automatizadas con </w:t>
+      </w:r>
+      <w:proofErr w:type="spellStart"/>
+      <w:r>
+        <w:rPr>
+          <w:lang w:val="es-CO"/>
+        </w:rPr>
+        <w:t>pytest</w:t>
+      </w:r>
+      <w:proofErr w:type="spellEnd"/>
+      <w:r>
+        <w:rPr>
+          <w:lang w:val="es-CO"/>
+        </w:rPr>
+        <w:t xml:space="preserve">, las cuales verifican que el registro de fábricas y la creación de </w:t>
+      </w:r>
+      <w:r>
+        <w:rPr>
+          <w:lang w:val="es-CO"/>
+        </w:rPr>
+        <w:lastRenderedPageBreak/>
+        <w:t xml:space="preserve">cada tipo de dispositivo </w:t>
+      </w:r>
+      <w:proofErr w:type="spellStart"/>
+      <w:r>
+        <w:rPr>
+          <w:lang w:val="es-CO"/>
+        </w:rPr>
+        <w:t>IoT</w:t>
+      </w:r>
+      <w:proofErr w:type="spellEnd"/>
+      <w:r>
+        <w:rPr>
+          <w:lang w:val="es-CO"/>
+        </w:rPr>
+        <w:t xml:space="preserve"> funcionan correctamente. Como se observa en la Figura 5, la suite tests/test_factory_method.py ejecutó 16 pruebas, todas ellas superadas exitosamente, lo que confirma junto con la validación previa del patrón Singleton que el conjunto completo de pruebas automatizadas del proyecto pasa sin errores.</w:t>
+      </w:r>
+    </w:p>
+    <w:p>
+      <w:pPr>
+        <w:spacing w:before="200" w:line="480" w:lineRule="auto"/>
+        <w:rPr>
+          <w:lang w:val="es-CO"/>
+        </w:rPr>
+      </w:pPr>
+      <w:bookmarkStart w:id="24" w:name="bm_fig5"/>
+      <w:r>
+        <w:rPr>
+          <w:b/>
+          <w:bCs/>
+          <w:lang w:val="es-CO"/>
+        </w:rPr>
+        <w:t>Figura 5</w:t>
+      </w:r>
+      <w:bookmarkEnd w:id="24"/>
+    </w:p>
+    <w:p>
+      <w:pPr>
+        <w:spacing w:line="480" w:lineRule="auto"/>
+        <w:rPr>
+          <w:lang w:val="es-CO"/>
+        </w:rPr>
+      </w:pPr>
+      <w:r>
+        <w:rPr>
+          <w:i/>
+          <w:iCs/>
           <w:lang w:val="es-CO"/>
         </w:rPr>
         <w:t>Resultados de la ejecución de las pruebas unitarias del patrón Factory Method</w:t>
@@ -6227,10 +6512,10 @@
           <w:noProof/>
         </w:rPr>
         <w:drawing>
-          <wp:inline distT="0" distB="0" distL="0" distR="0" wp14:anchorId="1AC7CC2A" wp14:editId="7DF03315">
+          <wp:inline distT="0" distB="0" distL="0" distR="0" wp14:anchorId="1E5BEED2" wp14:editId="47E5A2AA">
             <wp:extent cx="5486400" cy="2095500"/>
             <wp:effectExtent l="0" t="0" r="0" b="0"/>
-            <wp:docPr id="587997012" name="Imagen 587997012"/>
+            <wp:docPr id="1570566568" name="Imagen 1570566568"/>
             <wp:cNvGraphicFramePr>
               <a:graphicFrameLocks xmlns:a="http://schemas.openxmlformats.org/drawingml/2006/main" noChangeAspect="1"/>
             </wp:cNvGraphicFramePr>
@@ -6343,7 +6628,6 @@
         <w:rPr>
           <w:lang w:val="es-CO"/>
         </w:rPr>
-        <w:lastRenderedPageBreak/>
         <w:t xml:space="preserve">Además de las pruebas unitarias, el funcionamiento del patrón se validó de manera funcional a través de la API y de la interfaz de la plataforma. La Figura 6 muestra la documentación interactiva (Swagger) generada por </w:t>
       </w:r>
       <w:proofErr w:type="spellStart"/>
@@ -6452,16 +6736,17 @@
           <w:lang w:val="es-CO"/>
         </w:rPr>
       </w:pPr>
-      <w:bookmarkStart w:id="23" w:name="bm_fig6"/>
+      <w:bookmarkStart w:id="25" w:name="bm_fig6"/>
       <w:r>
         <w:rPr>
           <w:b/>
           <w:bCs/>
           <w:lang w:val="es-CO"/>
         </w:rPr>
+        <w:lastRenderedPageBreak/>
         <w:t>Figura 6</w:t>
       </w:r>
-      <w:bookmarkEnd w:id="23"/>
+      <w:bookmarkEnd w:id="25"/>
     </w:p>
     <w:p>
       <w:pPr>
@@ -6525,10 +6810,10 @@
           <w:noProof/>
         </w:rPr>
         <w:drawing>
-          <wp:inline distT="0" distB="0" distL="0" distR="0" wp14:anchorId="02E4A5F1" wp14:editId="18BEC507">
+          <wp:inline distT="0" distB="0" distL="0" distR="0" wp14:anchorId="4F9E2C53" wp14:editId="02173A75">
             <wp:extent cx="4114800" cy="2638425"/>
             <wp:effectExtent l="0" t="0" r="0" b="0"/>
-            <wp:docPr id="1161168438" name="Imagen 1161168438"/>
+            <wp:docPr id="1291044636" name="Imagen 1291044636"/>
             <wp:cNvGraphicFramePr>
               <a:graphicFrameLocks xmlns:a="http://schemas.openxmlformats.org/drawingml/2006/main" noChangeAspect="1"/>
             </wp:cNvGraphicFramePr>
@@ -6683,14 +6968,7 @@
         <w:rPr>
           <w:lang w:val="es-CO"/>
         </w:rPr>
-        <w:t xml:space="preserve">. Es </w:t>
-      </w:r>
-      <w:r>
-        <w:rPr>
-          <w:lang w:val="es-CO"/>
-        </w:rPr>
-        <w:lastRenderedPageBreak/>
-        <w:t>precisamente este parámetro el que el Factory Method utiliza para decidir, en tiempo de ejecución, qué producto concreto (</w:t>
+        <w:t>. Es precisamente este parámetro el que el Factory Method utiliza para decidir, en tiempo de ejecución, qué producto concreto (</w:t>
       </w:r>
       <w:proofErr w:type="spellStart"/>
       <w:r>
@@ -6742,7 +7020,7 @@
           <w:lang w:val="es-CO"/>
         </w:rPr>
       </w:pPr>
-      <w:bookmarkStart w:id="24" w:name="bm_fig7"/>
+      <w:bookmarkStart w:id="26" w:name="bm_fig7"/>
       <w:r>
         <w:rPr>
           <w:b/>
@@ -6751,7 +7029,7 @@
         </w:rPr>
         <w:t>Figura 7</w:t>
       </w:r>
-      <w:bookmarkEnd w:id="24"/>
+      <w:bookmarkEnd w:id="26"/>
     </w:p>
     <w:p>
       <w:pPr>
@@ -6796,11 +7074,12 @@
         <w:rPr>
           <w:noProof/>
         </w:rPr>
+        <w:lastRenderedPageBreak/>
         <w:drawing>
-          <wp:inline distT="0" distB="0" distL="0" distR="0" wp14:anchorId="6999530B" wp14:editId="3A13B200">
+          <wp:inline distT="0" distB="0" distL="0" distR="0" wp14:anchorId="502A46DC" wp14:editId="00ED5426">
             <wp:extent cx="4114800" cy="2800350"/>
             <wp:effectExtent l="0" t="0" r="0" b="0"/>
-            <wp:docPr id="1760296653" name="Imagen 1760296653"/>
+            <wp:docPr id="933452324" name="Imagen 933452324"/>
             <wp:cNvGraphicFramePr>
               <a:graphicFrameLocks xmlns:a="http://schemas.openxmlformats.org/drawingml/2006/main" noChangeAspect="1"/>
             </wp:cNvGraphicFramePr>
@@ -6914,13 +7193,45 @@
     </w:p>
     <w:p>
       <w:pPr>
+        <w:spacing w:before="120" w:line="480" w:lineRule="auto"/>
+        <w:rPr>
+          <w:lang w:val="es-CO"/>
+        </w:rPr>
+      </w:pPr>
+    </w:p>
+    <w:p>
+      <w:pPr>
+        <w:spacing w:before="120" w:line="480" w:lineRule="auto"/>
+        <w:rPr>
+          <w:lang w:val="es-CO"/>
+        </w:rPr>
+      </w:pPr>
+    </w:p>
+    <w:p>
+      <w:pPr>
+        <w:spacing w:before="120" w:line="480" w:lineRule="auto"/>
+        <w:rPr>
+          <w:lang w:val="es-CO"/>
+        </w:rPr>
+      </w:pPr>
+    </w:p>
+    <w:p>
+      <w:pPr>
+        <w:spacing w:before="120" w:line="480" w:lineRule="auto"/>
+        <w:rPr>
+          <w:lang w:val="es-CO"/>
+        </w:rPr>
+      </w:pPr>
+    </w:p>
+    <w:p>
+      <w:pPr>
         <w:pStyle w:val="Ttulo3"/>
         <w:spacing w:before="200" w:after="100" w:line="480" w:lineRule="auto"/>
         <w:rPr>
           <w:lang w:val="es-CO"/>
         </w:rPr>
       </w:pPr>
-      <w:bookmarkStart w:id="25" w:name="bm_factory_conclusion"/>
+      <w:bookmarkStart w:id="27" w:name="bm_factory_conclusion"/>
       <w:r>
         <w:rPr>
           <w:b/>
@@ -6933,7 +7244,7 @@
         <w:lastRenderedPageBreak/>
         <w:t>Conclusión</w:t>
       </w:r>
-      <w:bookmarkEnd w:id="25"/>
+      <w:bookmarkEnd w:id="27"/>
     </w:p>
     <w:p>
       <w:pPr>
@@ -6979,7 +7290,7 @@
         <w:spacing w:before="240" w:after="240" w:line="480" w:lineRule="auto"/>
         <w:jc w:val="center"/>
       </w:pPr>
-      <w:bookmarkStart w:id="26" w:name="bm_referencias"/>
+      <w:bookmarkStart w:id="28" w:name="bm_referencias"/>
       <w:r>
         <w:rPr>
           <w:b/>
@@ -6990,7 +7301,7 @@
         </w:rPr>
         <w:t>Referencias</w:t>
       </w:r>
-      <w:bookmarkEnd w:id="26"/>
+      <w:bookmarkEnd w:id="28"/>
     </w:p>
     <w:p>
       <w:pPr>
@@ -7147,10 +7458,10 @@
 <file path=word/numbering.xml><?xml version="1.0" encoding="utf-8"?>
 <w:numbering xmlns:wpc="http://schemas.microsoft.com/office/word/2010/wordprocessingCanvas" xmlns:cx="http://schemas.microsoft.com/office/drawing/2014/chartex" xmlns:cx1="http://schemas.microsoft.com/office/drawing/2015/9/8/chartex" xmlns:cx2="http://schemas.microsoft.com/office/drawing/2015/10/21/chartex" xmlns:cx3="http://schemas.microsoft.com/office/drawing/2016/5/9/chartex" xmlns:cx4="http://schemas.microsoft.com/office/drawing/2016/5/10/chartex" xmlns:cx5="http://schemas.microsoft.com/office/drawing/2016/5/11/chartex" xmlns:cx6="http://schemas.microsoft.com/office/drawing/2016/5/12/chartex" xmlns:cx7="http://schemas.microsoft.com/office/drawing/2016/5/13/chartex" xmlns:cx8="http://schemas.microsoft.com/office/drawing/2016/5/14/chartex" xmlns:mc="http://schemas.openxmlformats.org/markup-compatibility/2006" xmlns:aink="http://schemas.microsoft.com/office/drawing/2016/ink" xmlns:am3d="http://schemas.microsoft.com/office/drawing/2017/model3d" xmlns:o="urn:schemas-microsoft-com:office:office" xmlns:oel="http://schemas.microsoft.com/office/2019/extlst" xmlns:r="http://schemas.openxmlformats.org/officeDocument/2006/relationships" xmlns:m="http://schemas.openxmlformats.org/officeDocument/2006/math" xmlns:v="urn:schemas-microsoft-com:vml" xmlns:wp14="http://schemas.microsoft.com/office/word/2010/wordprocessingDrawing" xmlns:wp="http://schemas.openxmlformats.org/drawingml/2006/wordprocessingDrawing" xmlns:w10="urn:schemas-microsoft-com:office:word" xmlns:w="http://schemas.openxmlformats.org/wordprocessingml/2006/main" xmlns:w14="http://schemas.microsoft.com/office/word/2010/wordml" xmlns:w15="http://schemas.microsoft.com/office/word/2012/wordml" xmlns:w16cex="http://schemas.microsoft.com/office/word/2018/wordml/cex" xmlns:w16cid="http://schemas.microsoft.com/office/word/2016/wordml/cid" xmlns:w16="http://schemas.microsoft.com/office/word/2018/wordml" xmlns:w16du="http://schemas.microsoft.com/office/word/2023/wordml/word16du" xmlns:w16sdtdh="http://schemas.microsoft.com/office/word/2020/wordml/sdtdatahash" xmlns:w16sdtfl="http://schemas.microsoft.com/office/word/2024/wordml/sdtformatlock" xmlns:w16se="http://schemas.microsoft.com/office/word/2015/wordml/symex" xmlns:wpg="http://schemas.microsoft.com/office/word/2010/wordprocessingGroup" xmlns:wpi="http://schemas.microsoft.com/office/word/2010/wordprocessingInk" xmlns:wne="http://schemas.microsoft.com/office/word/2006/wordml" xmlns:wps="http://schemas.microsoft.com/office/word/2010/wordprocessingShape" mc:Ignorable="w14 w15 w16se w16cid w16 w16cex w16sdtdh w16sdtfl w16du wp14">
   <w:abstractNum w:abstractNumId="0" w15:restartNumberingAfterBreak="0">
-    <w:nsid w:val="3EBA290B"/>
+    <w:nsid w:val="40832FD4"/>
     <w:multiLevelType w:val="hybridMultilevel"/>
-    <w:tmpl w:val="58309912"/>
-    <w:lvl w:ilvl="0" w:tplc="C2CA6E86">
+    <w:tmpl w:val="ADCE6820"/>
+    <w:lvl w:ilvl="0" w:tplc="05329ED4">
       <w:start w:val="1"/>
       <w:numFmt w:val="bullet"/>
       <w:lvlText w:val="●"/>
@@ -7159,7 +7470,7 @@
         <w:ind w:left="720" w:hanging="360"/>
       </w:pPr>
     </w:lvl>
-    <w:lvl w:ilvl="1" w:tplc="65A49C4C">
+    <w:lvl w:ilvl="1" w:tplc="D51043B6">
       <w:start w:val="1"/>
       <w:numFmt w:val="bullet"/>
       <w:lvlText w:val="○"/>
@@ -7168,7 +7479,7 @@
         <w:ind w:left="1440" w:hanging="360"/>
       </w:pPr>
     </w:lvl>
-    <w:lvl w:ilvl="2" w:tplc="7E26DEA4">
+    <w:lvl w:ilvl="2" w:tplc="28A6C292">
       <w:start w:val="1"/>
       <w:numFmt w:val="bullet"/>
       <w:lvlText w:val="■"/>
@@ -7177,7 +7488,7 @@
         <w:ind w:left="2160" w:hanging="360"/>
       </w:pPr>
     </w:lvl>
-    <w:lvl w:ilvl="3" w:tplc="F9DC28F0">
+    <w:lvl w:ilvl="3" w:tplc="FDBA4E4A">
       <w:start w:val="1"/>
       <w:numFmt w:val="bullet"/>
       <w:lvlText w:val="●"/>
@@ -7186,7 +7497,7 @@
         <w:ind w:left="2880" w:hanging="360"/>
       </w:pPr>
     </w:lvl>
-    <w:lvl w:ilvl="4" w:tplc="DF3C7AB2">
+    <w:lvl w:ilvl="4" w:tplc="BCE67924">
       <w:start w:val="1"/>
       <w:numFmt w:val="bullet"/>
       <w:lvlText w:val="○"/>
@@ -7195,7 +7506,7 @@
         <w:ind w:left="3600" w:hanging="360"/>
       </w:pPr>
     </w:lvl>
-    <w:lvl w:ilvl="5" w:tplc="9244B982">
+    <w:lvl w:ilvl="5" w:tplc="F9283662">
       <w:start w:val="1"/>
       <w:numFmt w:val="bullet"/>
       <w:lvlText w:val="■"/>
@@ -7204,7 +7515,7 @@
         <w:ind w:left="4320" w:hanging="360"/>
       </w:pPr>
     </w:lvl>
-    <w:lvl w:ilvl="6" w:tplc="210C16D2">
+    <w:lvl w:ilvl="6" w:tplc="BD0CF1CA">
       <w:start w:val="1"/>
       <w:numFmt w:val="bullet"/>
       <w:lvlText w:val="●"/>
@@ -7213,7 +7524,7 @@
         <w:ind w:left="5040" w:hanging="360"/>
       </w:pPr>
     </w:lvl>
-    <w:lvl w:ilvl="7" w:tplc="E66C6310">
+    <w:lvl w:ilvl="7" w:tplc="66787672">
       <w:start w:val="1"/>
       <w:numFmt w:val="bullet"/>
       <w:lvlText w:val="●"/>
@@ -7222,7 +7533,7 @@
         <w:ind w:left="5760" w:hanging="360"/>
       </w:pPr>
     </w:lvl>
-    <w:lvl w:ilvl="8" w:tplc="B2143218">
+    <w:lvl w:ilvl="8" w:tplc="9584518A">
       <w:start w:val="1"/>
       <w:numFmt w:val="bullet"/>
       <w:lvlText w:val="●"/>
@@ -7233,10 +7544,10 @@
     </w:lvl>
   </w:abstractNum>
   <w:abstractNum w:abstractNumId="1" w15:restartNumberingAfterBreak="0">
-    <w:nsid w:val="5D0132F5"/>
+    <w:nsid w:val="5B645303"/>
     <w:multiLevelType w:val="hybridMultilevel"/>
-    <w:tmpl w:val="433223B0"/>
-    <w:lvl w:ilvl="0" w:tplc="7EB45802">
+    <w:tmpl w:val="B5FAC904"/>
+    <w:lvl w:ilvl="0" w:tplc="492810A8">
       <w:start w:val="1"/>
       <w:numFmt w:val="bullet"/>
       <w:lvlText w:val="•"/>
@@ -7245,54 +7556,54 @@
         <w:ind w:left="720" w:hanging="360"/>
       </w:pPr>
     </w:lvl>
-    <w:lvl w:ilvl="1" w:tplc="D0B40302">
+    <w:lvl w:ilvl="1" w:tplc="83B07510">
       <w:numFmt w:val="decimal"/>
       <w:lvlText w:val=""/>
       <w:lvlJc w:val="left"/>
     </w:lvl>
-    <w:lvl w:ilvl="2" w:tplc="C63453B8">
+    <w:lvl w:ilvl="2" w:tplc="606A3D28">
       <w:numFmt w:val="decimal"/>
       <w:lvlText w:val=""/>
       <w:lvlJc w:val="left"/>
     </w:lvl>
-    <w:lvl w:ilvl="3" w:tplc="41EA3520">
+    <w:lvl w:ilvl="3" w:tplc="9E8E1EB8">
       <w:numFmt w:val="decimal"/>
       <w:lvlText w:val=""/>
       <w:lvlJc w:val="left"/>
     </w:lvl>
-    <w:lvl w:ilvl="4" w:tplc="7466CD44">
+    <w:lvl w:ilvl="4" w:tplc="CCC429DA">
       <w:numFmt w:val="decimal"/>
       <w:lvlText w:val=""/>
       <w:lvlJc w:val="left"/>
     </w:lvl>
-    <w:lvl w:ilvl="5" w:tplc="55BCA100">
+    <w:lvl w:ilvl="5" w:tplc="F84E6850">
       <w:numFmt w:val="decimal"/>
       <w:lvlText w:val=""/>
       <w:lvlJc w:val="left"/>
     </w:lvl>
-    <w:lvl w:ilvl="6" w:tplc="0818EAAC">
+    <w:lvl w:ilvl="6" w:tplc="357ADB40">
       <w:numFmt w:val="decimal"/>
       <w:lvlText w:val=""/>
       <w:lvlJc w:val="left"/>
     </w:lvl>
-    <w:lvl w:ilvl="7" w:tplc="78D05DF4">
+    <w:lvl w:ilvl="7" w:tplc="C8585FA0">
       <w:numFmt w:val="decimal"/>
       <w:lvlText w:val=""/>
       <w:lvlJc w:val="left"/>
     </w:lvl>
-    <w:lvl w:ilvl="8" w:tplc="E8C0B796">
+    <w:lvl w:ilvl="8" w:tplc="1A6E2DBC">
       <w:numFmt w:val="decimal"/>
       <w:lvlText w:val=""/>
       <w:lvlJc w:val="left"/>
     </w:lvl>
   </w:abstractNum>
-  <w:num w:numId="1" w16cid:durableId="1823424739">
+  <w:num w:numId="1" w16cid:durableId="520970978">
     <w:abstractNumId w:val="0"/>
     <w:lvlOverride w:ilvl="0">
       <w:startOverride w:val="1"/>
     </w:lvlOverride>
   </w:num>
-  <w:num w:numId="2" w16cid:durableId="324018983">
+  <w:num w:numId="2" w16cid:durableId="872961730">
     <w:abstractNumId w:val="1"/>
     <w:lvlOverride w:ilvl="0">
       <w:startOverride w:val="1"/>

</xml_diff>

<commit_message>
Agrega patron Builder (reporte energetico) e integra en backend, API y frontend
</commit_message>
<xml_diff>
--- a/plataforma-Comercio-Energia.docx
+++ b/plataforma-Comercio-Energia.docx
@@ -1172,6 +1172,292 @@
           <w:tab w:val="right" w:leader="dot" w:pos="9360"/>
         </w:tabs>
         <w:spacing w:after="80" w:line="360" w:lineRule="auto"/>
+        <w:ind w:left="360"/>
+        <w:rPr>
+          <w:lang w:val="es-CO"/>
+        </w:rPr>
+      </w:pPr>
+      <w:r>
+        <w:rPr>
+          <w:lang w:val="es-CO"/>
+        </w:rPr>
+        <w:t xml:space="preserve">Aplicación del Patrón de Diseño Abstract Factory en los Canales de Notificación de la Plataforma</w:t>
+      </w:r>
+      <w:r>
+        <w:rPr>
+          <w:lang w:val="es-CO"/>
+        </w:rPr>
+        <w:tab/>
+      </w:r>
+      <w:r>
+        <w:fldChar w:fldCharType="begin"/>
+      </w:r>
+      <w:r>
+        <w:rPr>
+          <w:lang w:val="es-CO"/>
+        </w:rPr>
+        <w:instrText>PAGEREF bm_abstract \h</w:instrText>
+      </w:r>
+      <w:r>
+        <w:fldChar w:fldCharType="separate"/>
+      </w:r>
+      <w:r>
+        <w:rPr>
+          <w:noProof/>
+          <w:lang w:val="es-CO"/>
+        </w:rPr>
+        <w:t>1</w:t>
+      </w:r>
+      <w:r>
+        <w:fldChar w:fldCharType="end"/>
+      </w:r>
+    </w:p>
+    <w:p>
+      <w:pPr>
+        <w:tabs>
+          <w:tab w:val="right" w:leader="dot" w:pos="9360"/>
+        </w:tabs>
+        <w:spacing w:after="80" w:line="360" w:lineRule="auto"/>
+        <w:ind w:left="720"/>
+        <w:rPr>
+          <w:lang w:val="es-CO"/>
+        </w:rPr>
+      </w:pPr>
+      <w:r>
+        <w:rPr>
+          <w:i/>
+          <w:iCs/>
+          <w:lang w:val="es-CO"/>
+        </w:rPr>
+        <w:t xml:space="preserve">El Problema que Resuelve</w:t>
+      </w:r>
+      <w:r>
+        <w:rPr>
+          <w:lang w:val="es-CO"/>
+        </w:rPr>
+        <w:tab/>
+      </w:r>
+      <w:r>
+        <w:fldChar w:fldCharType="begin"/>
+      </w:r>
+      <w:r>
+        <w:rPr>
+          <w:lang w:val="es-CO"/>
+        </w:rPr>
+        <w:instrText>PAGEREF bm_abstract_problema \h</w:instrText>
+      </w:r>
+      <w:r>
+        <w:fldChar w:fldCharType="separate"/>
+      </w:r>
+      <w:r>
+        <w:rPr>
+          <w:noProof/>
+          <w:lang w:val="es-CO"/>
+        </w:rPr>
+        <w:t>1</w:t>
+      </w:r>
+      <w:r>
+        <w:fldChar w:fldCharType="end"/>
+      </w:r>
+    </w:p>
+    <w:p>
+      <w:pPr>
+        <w:tabs>
+          <w:tab w:val="right" w:leader="dot" w:pos="9360"/>
+        </w:tabs>
+        <w:spacing w:after="80" w:line="360" w:lineRule="auto"/>
+        <w:ind w:left="720"/>
+        <w:rPr>
+          <w:lang w:val="es-CO"/>
+        </w:rPr>
+      </w:pPr>
+      <w:r>
+        <w:rPr>
+          <w:i/>
+          <w:iCs/>
+          <w:lang w:val="es-CO"/>
+        </w:rPr>
+        <w:t xml:space="preserve">Cómo lo Soluciona el Patrón</w:t>
+      </w:r>
+      <w:r>
+        <w:rPr>
+          <w:lang w:val="es-CO"/>
+        </w:rPr>
+        <w:tab/>
+      </w:r>
+      <w:r>
+        <w:fldChar w:fldCharType="begin"/>
+      </w:r>
+      <w:r>
+        <w:rPr>
+          <w:lang w:val="es-CO"/>
+        </w:rPr>
+        <w:instrText>PAGEREF bm_abstract_solucion \h</w:instrText>
+      </w:r>
+      <w:r>
+        <w:fldChar w:fldCharType="separate"/>
+      </w:r>
+      <w:r>
+        <w:rPr>
+          <w:noProof/>
+          <w:lang w:val="es-CO"/>
+        </w:rPr>
+        <w:t>1</w:t>
+      </w:r>
+      <w:r>
+        <w:fldChar w:fldCharType="end"/>
+      </w:r>
+    </w:p>
+    <w:p>
+      <w:pPr>
+        <w:tabs>
+          <w:tab w:val="right" w:leader="dot" w:pos="9360"/>
+        </w:tabs>
+        <w:spacing w:after="80" w:line="360" w:lineRule="auto"/>
+        <w:ind w:left="720"/>
+        <w:rPr>
+          <w:lang w:val="es-CO"/>
+        </w:rPr>
+      </w:pPr>
+      <w:r>
+        <w:rPr>
+          <w:i/>
+          <w:iCs/>
+          <w:lang w:val="es-CO"/>
+        </w:rPr>
+        <w:t xml:space="preserve">Qué Gana la Plataforma con Esto</w:t>
+      </w:r>
+      <w:r>
+        <w:rPr>
+          <w:lang w:val="es-CO"/>
+        </w:rPr>
+        <w:tab/>
+      </w:r>
+      <w:r>
+        <w:fldChar w:fldCharType="begin"/>
+      </w:r>
+      <w:r>
+        <w:rPr>
+          <w:lang w:val="es-CO"/>
+        </w:rPr>
+        <w:instrText>PAGEREF bm_abstract_gana \h</w:instrText>
+      </w:r>
+      <w:r>
+        <w:fldChar w:fldCharType="separate"/>
+      </w:r>
+      <w:r>
+        <w:rPr>
+          <w:noProof/>
+          <w:lang w:val="es-CO"/>
+        </w:rPr>
+        <w:t>1</w:t>
+      </w:r>
+      <w:r>
+        <w:fldChar w:fldCharType="end"/>
+      </w:r>
+    </w:p>
+    <w:p>
+      <w:pPr>
+        <w:tabs>
+          <w:tab w:val="right" w:leader="dot" w:pos="9360"/>
+        </w:tabs>
+        <w:spacing w:after="80" w:line="360" w:lineRule="auto"/>
+        <w:ind w:left="720"/>
+        <w:rPr>
+          <w:lang w:val="es-CO"/>
+        </w:rPr>
+      </w:pPr>
+      <w:r>
+        <w:rPr>
+          <w:i/>
+          <w:iCs/>
+          <w:lang w:val="es-CO"/>
+        </w:rPr>
+        <w:t xml:space="preserve">Justificación de su Uso en el Proyecto</w:t>
+      </w:r>
+      <w:r>
+        <w:rPr>
+          <w:lang w:val="es-CO"/>
+        </w:rPr>
+        <w:tab/>
+      </w:r>
+      <w:r>
+        <w:fldChar w:fldCharType="begin"/>
+      </w:r>
+      <w:r>
+        <w:rPr>
+          <w:lang w:val="es-CO"/>
+        </w:rPr>
+        <w:instrText>PAGEREF bm_abstract_justificacion \h</w:instrText>
+      </w:r>
+      <w:r>
+        <w:fldChar w:fldCharType="separate"/>
+      </w:r>
+      <w:r>
+        <w:rPr>
+          <w:noProof/>
+          <w:lang w:val="es-CO"/>
+        </w:rPr>
+        <w:t>1</w:t>
+      </w:r>
+      <w:r>
+        <w:fldChar w:fldCharType="end"/>
+      </w:r>
+    </w:p>
+    <w:p>
+      <w:pPr>
+        <w:tabs>
+          <w:tab w:val="right" w:leader="dot" w:pos="9360"/>
+        </w:tabs>
+        <w:spacing w:after="80" w:line="360" w:lineRule="auto"/>
+        <w:ind w:left="720"/>
+        <w:rPr>
+          <w:lang w:val="es-CO"/>
+        </w:rPr>
+      </w:pPr>
+      <w:r>
+        <w:rPr>
+          <w:i/>
+          <w:iCs/>
+          <w:lang w:val="es-CO"/>
+        </w:rPr>
+        <w:t xml:space="preserve">Validación del Patrón</w:t>
+      </w:r>
+      <w:r>
+        <w:rPr>
+          <w:lang w:val="es-CO"/>
+        </w:rPr>
+        <w:tab/>
+      </w:r>
+      <w:r>
+        <w:fldChar w:fldCharType="begin"/>
+      </w:r>
+      <w:r>
+        <w:rPr>
+          <w:lang w:val="es-CO"/>
+        </w:rPr>
+        <w:instrText>PAGEREF bm_abstract_validacion \h</w:instrText>
+      </w:r>
+      <w:r>
+        <w:fldChar w:fldCharType="separate"/>
+      </w:r>
+      <w:r>
+        <w:rPr>
+          <w:noProof/>
+          <w:lang w:val="es-CO"/>
+        </w:rPr>
+        <w:t>1</w:t>
+      </w:r>
+      <w:r>
+        <w:fldChar w:fldCharType="end"/>
+      </w:r>
+    </w:p>
+    <w:p>
+      <w:pPr>
+        <w:tabs>
+          <w:tab w:val="right" w:leader="dot" w:pos="9360"/>
+        </w:tabs>
+        <w:spacing w:after="80" w:line="360" w:lineRule="auto"/>
         <w:ind w:left="720"/>
         <w:rPr>
           <w:lang w:val="es-CO"/>
@@ -1734,6 +2020,190 @@
     </w:p>
     <w:p>
       <w:pPr>
+        <w:tabs>
+          <w:tab w:val="right" w:leader="dot" w:pos="9360"/>
+        </w:tabs>
+        <w:spacing w:after="80" w:line="360" w:lineRule="auto"/>
+        <w:ind w:left="360" w:hanging="360"/>
+        <w:rPr>
+          <w:lang w:val="es-CO"/>
+        </w:rPr>
+      </w:pPr>
+      <w:r>
+        <w:rPr>
+          <w:lang w:val="es-CO"/>
+        </w:rPr>
+        <w:t xml:space="preserve">Figura 8. Fábrica abstracta CanalNotificacionFactory y una de sus fábricas concretas en notificaciones.py</w:t>
+      </w:r>
+      <w:r>
+        <w:rPr>
+          <w:lang w:val="es-CO"/>
+        </w:rPr>
+        <w:tab/>
+      </w:r>
+      <w:r>
+        <w:fldChar w:fldCharType="begin"/>
+      </w:r>
+      <w:r>
+        <w:rPr>
+          <w:lang w:val="es-CO"/>
+        </w:rPr>
+        <w:instrText>PAGEREF bm_fig8 \h</w:instrText>
+      </w:r>
+      <w:r>
+        <w:fldChar w:fldCharType="separate"/>
+      </w:r>
+      <w:r>
+        <w:rPr>
+          <w:noProof/>
+          <w:lang w:val="es-CO"/>
+        </w:rPr>
+        <w:t>1</w:t>
+      </w:r>
+      <w:r>
+        <w:fldChar w:fldCharType="end"/>
+      </w:r>
+    </w:p>
+    <w:p>
+      <w:pPr>
+        <w:tabs>
+          <w:tab w:val="right" w:leader="dot" w:pos="9360"/>
+        </w:tabs>
+        <w:spacing w:after="80" w:line="360" w:lineRule="auto"/>
+        <w:ind w:left="360" w:hanging="360"/>
+        <w:rPr>
+          <w:lang w:val="es-CO"/>
+        </w:rPr>
+      </w:pPr>
+      <w:r>
+        <w:rPr>
+          <w:lang w:val="es-CO"/>
+        </w:rPr>
+        <w:t xml:space="preserve">Figura 9. Resultados de la ejecución de las pruebas unitarias del patrón Abstract Factory</w:t>
+      </w:r>
+      <w:r>
+        <w:rPr>
+          <w:lang w:val="es-CO"/>
+        </w:rPr>
+        <w:tab/>
+      </w:r>
+      <w:r>
+        <w:fldChar w:fldCharType="begin"/>
+      </w:r>
+      <w:r>
+        <w:rPr>
+          <w:lang w:val="es-CO"/>
+        </w:rPr>
+        <w:instrText>PAGEREF bm_fig9 \h</w:instrText>
+      </w:r>
+      <w:r>
+        <w:fldChar w:fldCharType="separate"/>
+      </w:r>
+      <w:r>
+        <w:rPr>
+          <w:noProof/>
+          <w:lang w:val="es-CO"/>
+        </w:rPr>
+        <w:t>1</w:t>
+      </w:r>
+      <w:r>
+        <w:fldChar w:fldCharType="end"/>
+      </w:r>
+    </w:p>
+    <w:p>
+      <w:pPr>
+        <w:tabs>
+          <w:tab w:val="right" w:leader="dot" w:pos="9360"/>
+        </w:tabs>
+        <w:spacing w:after="80" w:line="360" w:lineRule="auto"/>
+        <w:ind w:left="360" w:hanging="360"/>
+        <w:rPr>
+          <w:lang w:val="es-CO"/>
+        </w:rPr>
+      </w:pPr>
+      <w:r>
+        <w:rPr>
+          <w:lang w:val="es-CO"/>
+        </w:rPr>
+        <w:t xml:space="preserve">Figura 10. Documentación interactiva (Swagger) de los endpoints de notificaciones de la API</w:t>
+      </w:r>
+      <w:r>
+        <w:rPr>
+          <w:lang w:val="es-CO"/>
+        </w:rPr>
+        <w:tab/>
+      </w:r>
+      <w:r>
+        <w:fldChar w:fldCharType="begin"/>
+      </w:r>
+      <w:r>
+        <w:rPr>
+          <w:lang w:val="es-CO"/>
+        </w:rPr>
+        <w:instrText>PAGEREF bm_fig10 \h</w:instrText>
+      </w:r>
+      <w:r>
+        <w:fldChar w:fldCharType="separate"/>
+      </w:r>
+      <w:r>
+        <w:rPr>
+          <w:noProof/>
+          <w:lang w:val="es-CO"/>
+        </w:rPr>
+        <w:t>1</w:t>
+      </w:r>
+      <w:r>
+        <w:fldChar w:fldCharType="end"/>
+      </w:r>
+    </w:p>
+    <w:p>
+      <w:pPr>
+        <w:tabs>
+          <w:tab w:val="right" w:leader="dot" w:pos="9360"/>
+        </w:tabs>
+        <w:spacing w:after="80" w:line="360" w:lineRule="auto"/>
+        <w:ind w:left="360" w:hanging="360"/>
+        <w:rPr>
+          <w:lang w:val="es-CO"/>
+        </w:rPr>
+      </w:pPr>
+      <w:r>
+        <w:rPr>
+          <w:lang w:val="es-CO"/>
+        </w:rPr>
+        <w:t xml:space="preserve">Figura 11. Interfaz de la plataforma mostrando un mismo aviso con el formato de cada canal</w:t>
+      </w:r>
+      <w:r>
+        <w:rPr>
+          <w:lang w:val="es-CO"/>
+        </w:rPr>
+        <w:tab/>
+      </w:r>
+      <w:r>
+        <w:fldChar w:fldCharType="begin"/>
+      </w:r>
+      <w:r>
+        <w:rPr>
+          <w:lang w:val="es-CO"/>
+        </w:rPr>
+        <w:instrText>PAGEREF bm_fig11 \h</w:instrText>
+      </w:r>
+      <w:r>
+        <w:fldChar w:fldCharType="separate"/>
+      </w:r>
+      <w:r>
+        <w:rPr>
+          <w:noProof/>
+          <w:lang w:val="es-CO"/>
+        </w:rPr>
+        <w:t>1</w:t>
+      </w:r>
+      <w:r>
+        <w:fldChar w:fldCharType="end"/>
+      </w:r>
+    </w:p>
+    <w:p>
+      <w:pPr>
         <w:pageBreakBefore/>
         <w:rPr>
           <w:lang w:val="es-CO"/>
@@ -1773,7 +2243,7 @@
         <w:rPr>
           <w:lang w:val="es-CO"/>
         </w:rPr>
-        <w:t>El presente documento contextualiza el proyecto Plataforma de Comercio de Energía, una solución digital orientada a facilitar la compra y venta de excedentes energéticos entre usuarios en contextos de generación distribuida, como paneles solares domésticos y baterías inteligentes. Adicionalmente, se explica la implementación de dos patrones de diseño aplicados en el sistema: el patrón Singleton, que garantiza un punto único y consistente de acceso al estado de la plataforma (</w:t>
+        <w:t>El presente documento contextualiza el proyecto Plataforma de Comercio de Energía, una solución digital orientada a facilitar la compra y venta de excedentes energéticos entre usuarios en contextos de generación distribuida, como paneles solares domésticos y baterías inteligentes. Adicionalmente, se explica la implementación de tres patrones de diseño aplicados en el sistema: el patrón Singleton, que garantiza un punto único y consistente de acceso al estado de la plataforma (</w:t>
       </w:r>
       <w:proofErr w:type="spellStart"/>
       <w:r>
@@ -1787,7 +2257,7 @@
         <w:rPr>
           <w:lang w:val="es-CO"/>
         </w:rPr>
-        <w:t xml:space="preserve">) de forma segura ante la concurrencia, y el patrón Factory Method, que resuelve la integración de distintos tipos de dispositivos </w:t>
+        <w:t xml:space="preserve">) de forma segura ante la concurrencia; el patrón Factory Method, que resuelve la integración de distintos tipos de dispositivos </w:t>
       </w:r>
       <w:proofErr w:type="spellStart"/>
       <w:r>
@@ -1801,7 +2271,7 @@
         <w:rPr>
           <w:lang w:val="es-CO"/>
         </w:rPr>
-        <w:t xml:space="preserve"> domésticos (paneles solares, baterías inteligentes y medidores). Se describe la problemática que motiva el proyecto, la propuesta de solución, las funcionalidades principales, el objetivo general y el impacto esperado, así como el problema técnico que motiva cada patrón, la solución propuesta a partir de las clases involucradas y los beneficios que aportan a la consistencia, la escalabilidad y la mantenibilidad del sistema.</w:t>
+        <w:t xml:space="preserve"> domésticos (paneles solares, baterías inteligentes y medidores), y el patrón Abstract Factory, que organiza los canales de notificación (correo, SMS y notificación push) para que cada uno genere la familia completa de avisos con un formato coherente. Se describe la problemática que motiva el proyecto, la propuesta de solución, las funcionalidades principales, el objetivo general y el impacto esperado, así como el problema técnico que motiva cada patrón, la solución propuesta a partir de las clases involucradas y los beneficios que aportan a la consistencia, la escalabilidad y la mantenibilidad del sistema.</w:t>
       </w:r>
     </w:p>
     <w:p>
@@ -1823,7 +2293,7 @@
         <w:rPr>
           <w:lang w:val="es-CO"/>
         </w:rPr>
-        <w:t xml:space="preserve">comercio de energía, Singleton, Factory Method, patrones de diseño, </w:t>
+        <w:t xml:space="preserve">comercio de energía, Singleton, Factory Method, Abstract Factory, patrones de diseño, </w:t>
       </w:r>
       <w:proofErr w:type="spellStart"/>
       <w:r>
@@ -7225,13 +7695,50 @@
     </w:p>
     <w:p>
       <w:pPr>
+        <w:pStyle w:val="Ttulo2"/>
+        <w:spacing w:before="240" w:after="120" w:line="480" w:lineRule="auto"/>
+        <w:rPr>
+          <w:lang w:val="es-CO"/>
+        </w:rPr>
+      </w:pPr>
+      <w:bookmarkStart w:id="30" w:name="bm_abstract"/>
+      <w:r>
+        <w:rPr>
+          <w:b/>
+          <w:bCs/>
+          <w:color w:val="000000"/>
+          <w:sz w:val="24"/>
+          <w:szCs w:val="24"/>
+          <w:lang w:val="es-CO"/>
+        </w:rPr>
+        <w:t xml:space="preserve">Aplicación del Patrón de Diseño Abstract Factory en los Canales de Notificación de la Plataforma</w:t>
+      </w:r>
+      <w:bookmarkEnd w:id="30"/>
+    </w:p>
+    <w:p>
+      <w:pPr>
+        <w:spacing w:line="480" w:lineRule="auto"/>
+        <w:jc w:val="both"/>
+        <w:rPr>
+          <w:lang w:val="es-CO"/>
+        </w:rPr>
+      </w:pPr>
+      <w:r>
+        <w:rPr>
+          <w:lang w:val="es-CO"/>
+        </w:rPr>
+        <w:t xml:space="preserve">El patrón Abstract Factory incorporado a la plataforma resuelve la manera en que el sistema comunica a los usuarios los eventos relevantes del mercado energético. La Plataforma de Comercio de Energía debe notificar en tres momentos distintos —el cierre de una operación en la subasta, una lectura de un dispositivo IoT fuera de su rango normal y el envío del reporte periódico de producción y consumo— y cada usuario elige el canal por el que desea recibir esos avisos: correo electrónico, mensaje de texto (SMS) o notificación push a la aplicación móvil. Este módulo forma parte de la lógica de dominio del backend (notificaciones.py) y es consumido por la clase PlataformaEnergia y por la API FastAPI (main.py).</w:t>
+      </w:r>
+    </w:p>
+    <w:p>
+      <w:pPr>
         <w:pStyle w:val="Ttulo3"/>
         <w:spacing w:before="200" w:after="100" w:line="480" w:lineRule="auto"/>
         <w:rPr>
           <w:lang w:val="es-CO"/>
         </w:rPr>
       </w:pPr>
-      <w:bookmarkStart w:id="27" w:name="bm_factory_conclusion"/>
+      <w:bookmarkStart w:id="31" w:name="bm_abstract_problema"/>
       <w:r>
         <w:rPr>
           <w:b/>
@@ -7241,6 +7748,1292 @@
           <w:color w:val="000000"/>
           <w:lang w:val="es-CO"/>
         </w:rPr>
+        <w:t xml:space="preserve">El Problema que Resuelve</w:t>
+      </w:r>
+      <w:bookmarkEnd w:id="31"/>
+    </w:p>
+    <w:p>
+      <w:pPr>
+        <w:spacing w:line="480" w:lineRule="auto"/>
+        <w:jc w:val="both"/>
+        <w:rPr>
+          <w:lang w:val="es-CO"/>
+        </w:rPr>
+      </w:pPr>
+      <w:r>
+        <w:rPr>
+          <w:lang w:val="es-CO"/>
+        </w:rPr>
+        <w:t xml:space="preserve">Cada canal de notificación impone su propio formato y sus propias restricciones. El correo electrónico admite un asunto y un cuerpo extenso con saludo y firma; el SMS no tiene asunto y su cuerpo no puede superar los 160 caracteres; la notificación push utiliza un título y un cuerpo breves acompañados de un objeto de datos estructurado (payload) que la aplicación móvil interpreta. Además, los tres tipos de aviso —transacción, alerta IoT y reporte— deben existir para cada uno de esos canales.</w:t>
+      </w:r>
+    </w:p>
+    <w:p>
+      <w:pPr>
+        <w:spacing w:line="480" w:lineRule="auto"/>
+        <w:jc w:val="both"/>
+        <w:rPr>
+          <w:lang w:val="es-CO"/>
+        </w:rPr>
+      </w:pPr>
+      <w:r>
+        <w:rPr>
+          <w:lang w:val="es-CO"/>
+        </w:rPr>
+        <w:t xml:space="preserve">Sin este patrón, la decisión de qué canal utilizar y cómo dar formato a cada mensaje quedaría dispersa mediante condicionales repetidos en los tres puntos del código donde se construye un aviso:</w:t>
+      </w:r>
+    </w:p>
+    <w:p>
+      <w:pPr>
+        <w:ind w:left="720"/>
+        <w:rPr>
+          <w:lang w:val="es-CO"/>
+        </w:rPr>
+      </w:pPr>
+      <w:r>
+        <w:rPr>
+          <w:rFonts w:ascii="Courier New" w:eastAsia="Courier New" w:hAnsi="Courier New" w:cs="Courier New"/>
+          <w:sz w:val="20"/>
+          <w:szCs w:val="20"/>
+          <w:lang w:val="es-CO"/>
+        </w:rPr>
+        <w:t xml:space="preserve">if canal == "sms":</w:t>
+      </w:r>
+    </w:p>
+    <w:p>
+      <w:pPr>
+        <w:ind w:left="720"/>
+        <w:rPr>
+          <w:lang w:val="es-CO"/>
+        </w:rPr>
+      </w:pPr>
+      <w:r>
+        <w:rPr>
+          <w:rFonts w:ascii="Courier New" w:eastAsia="Courier New" w:hAnsi="Courier New" w:cs="Courier New"/>
+          <w:sz w:val="20"/>
+          <w:szCs w:val="20"/>
+          <w:lang w:val="es-CO"/>
+        </w:rPr>
+        <w:t xml:space="preserve">    asunto = ""</w:t>
+      </w:r>
+    </w:p>
+    <w:p>
+      <w:pPr>
+        <w:ind w:left="720"/>
+        <w:rPr>
+          <w:lang w:val="es-CO"/>
+        </w:rPr>
+      </w:pPr>
+      <w:r>
+        <w:rPr>
+          <w:rFonts w:ascii="Courier New" w:eastAsia="Courier New" w:hAnsi="Courier New" w:cs="Courier New"/>
+          <w:sz w:val="20"/>
+          <w:szCs w:val="20"/>
+          <w:lang w:val="es-CO"/>
+        </w:rPr>
+        <w:t xml:space="preserve">    cuerpo = recortar(texto, 160)</w:t>
+      </w:r>
+    </w:p>
+    <w:p>
+      <w:pPr>
+        <w:ind w:left="720"/>
+        <w:rPr>
+          <w:lang w:val="es-CO"/>
+        </w:rPr>
+      </w:pPr>
+      <w:r>
+        <w:rPr>
+          <w:rFonts w:ascii="Courier New" w:eastAsia="Courier New" w:hAnsi="Courier New" w:cs="Courier New"/>
+          <w:sz w:val="20"/>
+          <w:szCs w:val="20"/>
+          <w:lang w:val="es-CO"/>
+        </w:rPr>
+        <w:t xml:space="preserve">elif canal == "email":</w:t>
+      </w:r>
+    </w:p>
+    <w:p>
+      <w:pPr>
+        <w:ind w:left="720"/>
+        <w:rPr>
+          <w:lang w:val="es-CO"/>
+        </w:rPr>
+      </w:pPr>
+      <w:r>
+        <w:rPr>
+          <w:rFonts w:ascii="Courier New" w:eastAsia="Courier New" w:hAnsi="Courier New" w:cs="Courier New"/>
+          <w:sz w:val="20"/>
+          <w:szCs w:val="20"/>
+          <w:lang w:val="es-CO"/>
+        </w:rPr>
+        <w:t xml:space="preserve">    asunto = "Operación cerrada en la subasta"</w:t>
+      </w:r>
+    </w:p>
+    <w:p>
+      <w:pPr>
+        <w:ind w:left="720"/>
+        <w:rPr>
+          <w:lang w:val="es-CO"/>
+        </w:rPr>
+      </w:pPr>
+      <w:r>
+        <w:rPr>
+          <w:rFonts w:ascii="Courier New" w:eastAsia="Courier New" w:hAnsi="Courier New" w:cs="Courier New"/>
+          <w:sz w:val="20"/>
+          <w:szCs w:val="20"/>
+          <w:lang w:val="es-CO"/>
+        </w:rPr>
+        <w:t xml:space="preserve">    cuerpo = redactar_correo(texto)</w:t>
+      </w:r>
+    </w:p>
+    <w:p>
+      <w:pPr>
+        <w:ind w:left="720"/>
+        <w:rPr>
+          <w:lang w:val="es-CO"/>
+        </w:rPr>
+      </w:pPr>
+      <w:r>
+        <w:rPr>
+          <w:rFonts w:ascii="Courier New" w:eastAsia="Courier New" w:hAnsi="Courier New" w:cs="Courier New"/>
+          <w:sz w:val="20"/>
+          <w:szCs w:val="20"/>
+          <w:lang w:val="es-CO"/>
+        </w:rPr>
+        <w:t xml:space="preserve">elif canal == "push":</w:t>
+      </w:r>
+    </w:p>
+    <w:p>
+      <w:pPr>
+        <w:ind w:left="720"/>
+        <w:rPr>
+          <w:lang w:val="es-CO"/>
+        </w:rPr>
+      </w:pPr>
+      <w:r>
+        <w:rPr>
+          <w:rFonts w:ascii="Courier New" w:eastAsia="Courier New" w:hAnsi="Courier New" w:cs="Courier New"/>
+          <w:sz w:val="20"/>
+          <w:szCs w:val="20"/>
+          <w:lang w:val="es-CO"/>
+        </w:rPr>
+        <w:t xml:space="preserve">    asunto = recortar(titulo, 40)</w:t>
+      </w:r>
+    </w:p>
+    <w:p>
+      <w:pPr>
+        <w:ind w:left="720"/>
+        <w:rPr>
+          <w:lang w:val="es-CO"/>
+        </w:rPr>
+      </w:pPr>
+      <w:r>
+        <w:rPr>
+          <w:rFonts w:ascii="Courier New" w:eastAsia="Courier New" w:hAnsi="Courier New" w:cs="Courier New"/>
+          <w:sz w:val="20"/>
+          <w:szCs w:val="20"/>
+          <w:lang w:val="es-CO"/>
+        </w:rPr>
+        <w:t xml:space="preserve">    cuerpo = recortar(texto, 120)</w:t>
+      </w:r>
+    </w:p>
+    <w:p>
+      <w:pPr>
+        <w:ind w:left="720"/>
+        <w:rPr>
+          <w:lang w:val="es-CO"/>
+        </w:rPr>
+      </w:pPr>
+      <w:r>
+        <w:rPr>
+          <w:rFonts w:ascii="Courier New" w:eastAsia="Courier New" w:hAnsi="Courier New" w:cs="Courier New"/>
+          <w:sz w:val="20"/>
+          <w:szCs w:val="20"/>
+          <w:lang w:val="es-CO"/>
+        </w:rPr>
+        <w:t xml:space="preserve">    datos = {"evento": "transaccion", ...}</w:t>
+      </w:r>
+    </w:p>
+    <w:p>
+      <w:pPr>
+        <w:spacing w:line="480" w:lineRule="auto"/>
+        <w:jc w:val="both"/>
+        <w:rPr>
+          <w:lang w:val="es-CO"/>
+        </w:rPr>
+      </w:pPr>
+      <w:r>
+        <w:rPr>
+          <w:lang w:val="es-CO"/>
+        </w:rPr>
+        <w:t xml:space="preserve">Esta duplicación es propensa a errores: es fácil combinar piezas incompatibles, como asignar un asunto de correo a un SMS o generar una notificación push sin su payload. Cada vez que se agregara un canal nuevo (por ejemplo, WhatsApp o Telegram) habría que modificar esos tres bloques.</w:t>
+      </w:r>
+    </w:p>
+    <w:p>
+      <w:pPr>
+        <w:pStyle w:val="Ttulo3"/>
+        <w:spacing w:before="200" w:after="100" w:line="480" w:lineRule="auto"/>
+        <w:rPr>
+          <w:lang w:val="es-CO"/>
+        </w:rPr>
+      </w:pPr>
+      <w:bookmarkStart w:id="32" w:name="bm_abstract_solucion"/>
+      <w:r>
+        <w:rPr>
+          <w:b/>
+          <w:bCs/>
+          <w:i/>
+          <w:iCs/>
+          <w:color w:val="000000"/>
+          <w:lang w:val="es-CO"/>
+        </w:rPr>
+        <w:t xml:space="preserve">Cómo lo Soluciona el Patrón</w:t>
+      </w:r>
+      <w:bookmarkEnd w:id="32"/>
+    </w:p>
+    <w:p>
+      <w:pPr>
+        <w:pStyle w:val="Prrafodelista"/>
+        <w:numPr>
+          <w:ilvl w:val="0"/>
+          <w:numId w:val="2"/>
+        </w:numPr>
+        <w:spacing w:line="480" w:lineRule="auto"/>
+        <w:jc w:val="both"/>
+        <w:rPr>
+          <w:lang w:val="es-CO"/>
+        </w:rPr>
+      </w:pPr>
+      <w:r>
+        <w:rPr>
+          <w:b/>
+          <w:bCs/>
+          <w:lang w:val="es-CO"/>
+        </w:rPr>
+        <w:t xml:space="preserve">Productos abstractos. </w:t>
+      </w:r>
+      <w:r>
+        <w:rPr>
+          <w:lang w:val="es-CO"/>
+        </w:rPr>
+        <w:t xml:space="preserve">NotificadorTransaccion, NotificadorAlertaIoT y FormateadorReporte definen la interfaz de cada tipo de aviso. Todos devuelven un mismo objeto de valor, Mensaje (con los campos canal, asunto, cuerpo y datos), de modo que el resto de la plataforma siempre trabaja con el mismo tipo.</w:t>
+      </w:r>
+    </w:p>
+    <w:p>
+      <w:pPr>
+        <w:pStyle w:val="Prrafodelista"/>
+        <w:numPr>
+          <w:ilvl w:val="0"/>
+          <w:numId w:val="2"/>
+        </w:numPr>
+        <w:spacing w:line="480" w:lineRule="auto"/>
+        <w:jc w:val="both"/>
+        <w:rPr>
+          <w:lang w:val="es-CO"/>
+        </w:rPr>
+      </w:pPr>
+      <w:r>
+        <w:rPr>
+          <w:b/>
+          <w:bCs/>
+          <w:lang w:val="es-CO"/>
+        </w:rPr>
+        <w:t xml:space="preserve">Fábrica abstracta. </w:t>
+      </w:r>
+      <w:r>
+        <w:rPr>
+          <w:lang w:val="es-CO"/>
+        </w:rPr>
+        <w:t xml:space="preserve">CanalNotificacionFactory declara los métodos de creación crear_notificador_transaccion(), crear_notificador_alerta_iot() y crear_formateador_reporte(), además de la propiedad canal. Representa a “un canal” capaz de construir su familia completa de notificadores.</w:t>
+      </w:r>
+    </w:p>
+    <w:p>
+      <w:pPr>
+        <w:pStyle w:val="Prrafodelista"/>
+        <w:numPr>
+          <w:ilvl w:val="0"/>
+          <w:numId w:val="2"/>
+        </w:numPr>
+        <w:spacing w:line="480" w:lineRule="auto"/>
+        <w:jc w:val="both"/>
+        <w:rPr>
+          <w:lang w:val="es-CO"/>
+        </w:rPr>
+      </w:pPr>
+      <w:r>
+        <w:rPr>
+          <w:b/>
+          <w:bCs/>
+          <w:lang w:val="es-CO"/>
+        </w:rPr>
+        <w:t xml:space="preserve">Fábricas concretas. </w:t>
+      </w:r>
+      <w:r>
+        <w:rPr>
+          <w:lang w:val="es-CO"/>
+        </w:rPr>
+        <w:t xml:space="preserve">CanalEmail, CanalSMS y CanalPush implementan esos métodos devolviendo sus propias variantes de notificador, todas coherentes entre sí: la familia de SMS nunca produce un asunto ni supera los 160 caracteres; la familia de push siempre incluye el payload.</w:t>
+      </w:r>
+    </w:p>
+    <w:p>
+      <w:pPr>
+        <w:pStyle w:val="Prrafodelista"/>
+        <w:numPr>
+          <w:ilvl w:val="0"/>
+          <w:numId w:val="2"/>
+        </w:numPr>
+        <w:spacing w:line="480" w:lineRule="auto"/>
+        <w:jc w:val="both"/>
+        <w:rPr>
+          <w:lang w:val="es-CO"/>
+        </w:rPr>
+      </w:pPr>
+      <w:r>
+        <w:rPr>
+          <w:b/>
+          <w:bCs/>
+          <w:lang w:val="es-CO"/>
+        </w:rPr>
+        <w:t xml:space="preserve">Cliente. </w:t>
+      </w:r>
+      <w:r>
+        <w:rPr>
+          <w:lang w:val="es-CO"/>
+        </w:rPr>
+        <w:t xml:space="preserve">ServicioNotificaciones recibe una sola fábrica de canal y construye con ella los tres notificadores. Cualquier aviso que emita saldrá por el mismo canal y respetará sus reglas, sin que la clase mencione ninguna implementación concreta.</w:t>
+      </w:r>
+    </w:p>
+    <w:p>
+      <w:pPr>
+        <w:pStyle w:val="Prrafodelista"/>
+        <w:numPr>
+          <w:ilvl w:val="0"/>
+          <w:numId w:val="2"/>
+        </w:numPr>
+        <w:spacing w:line="480" w:lineRule="auto"/>
+        <w:jc w:val="both"/>
+        <w:rPr>
+          <w:lang w:val="es-CO"/>
+        </w:rPr>
+      </w:pPr>
+      <w:r>
+        <w:rPr>
+          <w:b/>
+          <w:bCs/>
+          <w:lang w:val="es-CO"/>
+        </w:rPr>
+        <w:t xml:space="preserve">Punto único de resolución. </w:t>
+      </w:r>
+      <w:r>
+        <w:rPr>
+          <w:lang w:val="es-CO"/>
+        </w:rPr>
+        <w:t xml:space="preserve">La función crear_servicio(canal) —apoyada en obtener_canal(nombre)— traduce el canal preferido del usuario a la fábrica correspondiente; un canal no soportado produce un ValueError con la lista de canales válidos.</w:t>
+      </w:r>
+    </w:p>
+    <w:p>
+      <w:pPr>
+        <w:spacing w:before="200" w:line="480" w:lineRule="auto"/>
+        <w:rPr>
+          <w:lang w:val="es-CO"/>
+        </w:rPr>
+      </w:pPr>
+      <w:bookmarkStart w:id="36" w:name="bm_fig8"/>
+      <w:r>
+        <w:rPr>
+          <w:b/>
+          <w:bCs/>
+          <w:lang w:val="es-CO"/>
+        </w:rPr>
+        <w:t xml:space="preserve">Figura 8</w:t>
+      </w:r>
+      <w:bookmarkEnd w:id="36"/>
+    </w:p>
+    <w:p>
+      <w:pPr>
+        <w:spacing w:line="480" w:lineRule="auto"/>
+        <w:rPr>
+          <w:lang w:val="es-CO"/>
+        </w:rPr>
+      </w:pPr>
+      <w:r>
+        <w:rPr>
+          <w:i/>
+          <w:iCs/>
+          <w:lang w:val="es-CO"/>
+        </w:rPr>
+        <w:t xml:space="preserve">Fábrica abstracta CanalNotificacionFactory y una de sus fábricas concretas en notificaciones.py</w:t>
+      </w:r>
+    </w:p>
+    <w:p>
+      <w:pPr>
+        <w:ind w:left="720"/>
+        <w:rPr>
+          <w:lang w:val="es-CO"/>
+        </w:rPr>
+      </w:pPr>
+      <w:r>
+        <w:rPr>
+          <w:rFonts w:ascii="Courier New" w:eastAsia="Courier New" w:hAnsi="Courier New" w:cs="Courier New"/>
+          <w:sz w:val="20"/>
+          <w:szCs w:val="20"/>
+          <w:lang w:val="es-CO"/>
+        </w:rPr>
+        <w:t xml:space="preserve">class CanalNotificacionFactory(ABC):</w:t>
+      </w:r>
+    </w:p>
+    <w:p>
+      <w:pPr>
+        <w:ind w:left="720"/>
+        <w:rPr>
+          <w:lang w:val="es-CO"/>
+        </w:rPr>
+      </w:pPr>
+      <w:r>
+        <w:rPr>
+          <w:rFonts w:ascii="Courier New" w:eastAsia="Courier New" w:hAnsi="Courier New" w:cs="Courier New"/>
+          <w:sz w:val="20"/>
+          <w:szCs w:val="20"/>
+          <w:lang w:val="es-CO"/>
+        </w:rPr>
+        <w:t xml:space="preserve">    @property</w:t>
+      </w:r>
+    </w:p>
+    <w:p>
+      <w:pPr>
+        <w:ind w:left="720"/>
+        <w:rPr>
+          <w:lang w:val="es-CO"/>
+        </w:rPr>
+      </w:pPr>
+      <w:r>
+        <w:rPr>
+          <w:rFonts w:ascii="Courier New" w:eastAsia="Courier New" w:hAnsi="Courier New" w:cs="Courier New"/>
+          <w:sz w:val="20"/>
+          <w:szCs w:val="20"/>
+          <w:lang w:val="es-CO"/>
+        </w:rPr>
+        <w:t xml:space="preserve">    @abstractmethod</w:t>
+      </w:r>
+    </w:p>
+    <w:p>
+      <w:pPr>
+        <w:ind w:left="720"/>
+        <w:rPr>
+          <w:lang w:val="es-CO"/>
+        </w:rPr>
+      </w:pPr>
+      <w:r>
+        <w:rPr>
+          <w:rFonts w:ascii="Courier New" w:eastAsia="Courier New" w:hAnsi="Courier New" w:cs="Courier New"/>
+          <w:sz w:val="20"/>
+          <w:szCs w:val="20"/>
+          <w:lang w:val="es-CO"/>
+        </w:rPr>
+        <w:t xml:space="preserve">    def canal(self) -&gt; str: ...</w:t>
+      </w:r>
+    </w:p>
+    <w:p>
+      <w:pPr>
+        <w:ind w:left="720"/>
+        <w:rPr>
+          <w:lang w:val="es-CO"/>
+        </w:rPr>
+      </w:pPr>
+      <w:r>
+        <w:rPr>
+          <w:rFonts w:ascii="Courier New" w:eastAsia="Courier New" w:hAnsi="Courier New" w:cs="Courier New"/>
+          <w:sz w:val="20"/>
+          <w:szCs w:val="20"/>
+          <w:lang w:val="es-CO"/>
+        </w:rPr>
+        <w:t xml:space="preserve"> </w:t>
+      </w:r>
+    </w:p>
+    <w:p>
+      <w:pPr>
+        <w:ind w:left="720"/>
+        <w:rPr>
+          <w:lang w:val="es-CO"/>
+        </w:rPr>
+      </w:pPr>
+      <w:r>
+        <w:rPr>
+          <w:rFonts w:ascii="Courier New" w:eastAsia="Courier New" w:hAnsi="Courier New" w:cs="Courier New"/>
+          <w:sz w:val="20"/>
+          <w:szCs w:val="20"/>
+          <w:lang w:val="es-CO"/>
+        </w:rPr>
+        <w:t xml:space="preserve">    @abstractmethod</w:t>
+      </w:r>
+    </w:p>
+    <w:p>
+      <w:pPr>
+        <w:ind w:left="720"/>
+        <w:rPr>
+          <w:lang w:val="es-CO"/>
+        </w:rPr>
+      </w:pPr>
+      <w:r>
+        <w:rPr>
+          <w:rFonts w:ascii="Courier New" w:eastAsia="Courier New" w:hAnsi="Courier New" w:cs="Courier New"/>
+          <w:sz w:val="20"/>
+          <w:szCs w:val="20"/>
+          <w:lang w:val="es-CO"/>
+        </w:rPr>
+        <w:t xml:space="preserve">    def crear_notificador_transaccion(self) -&gt; NotificadorTransaccion: ...</w:t>
+      </w:r>
+    </w:p>
+    <w:p>
+      <w:pPr>
+        <w:ind w:left="720"/>
+        <w:rPr>
+          <w:lang w:val="es-CO"/>
+        </w:rPr>
+      </w:pPr>
+      <w:r>
+        <w:rPr>
+          <w:rFonts w:ascii="Courier New" w:eastAsia="Courier New" w:hAnsi="Courier New" w:cs="Courier New"/>
+          <w:sz w:val="20"/>
+          <w:szCs w:val="20"/>
+          <w:lang w:val="es-CO"/>
+        </w:rPr>
+        <w:t xml:space="preserve"> </w:t>
+      </w:r>
+    </w:p>
+    <w:p>
+      <w:pPr>
+        <w:ind w:left="720"/>
+        <w:rPr>
+          <w:lang w:val="es-CO"/>
+        </w:rPr>
+      </w:pPr>
+      <w:r>
+        <w:rPr>
+          <w:rFonts w:ascii="Courier New" w:eastAsia="Courier New" w:hAnsi="Courier New" w:cs="Courier New"/>
+          <w:sz w:val="20"/>
+          <w:szCs w:val="20"/>
+          <w:lang w:val="es-CO"/>
+        </w:rPr>
+        <w:t xml:space="preserve">    @abstractmethod</w:t>
+      </w:r>
+    </w:p>
+    <w:p>
+      <w:pPr>
+        <w:ind w:left="720"/>
+        <w:rPr>
+          <w:lang w:val="es-CO"/>
+        </w:rPr>
+      </w:pPr>
+      <w:r>
+        <w:rPr>
+          <w:rFonts w:ascii="Courier New" w:eastAsia="Courier New" w:hAnsi="Courier New" w:cs="Courier New"/>
+          <w:sz w:val="20"/>
+          <w:szCs w:val="20"/>
+          <w:lang w:val="es-CO"/>
+        </w:rPr>
+        <w:t xml:space="preserve">    def crear_notificador_alerta_iot(self) -&gt; NotificadorAlertaIoT: ...</w:t>
+      </w:r>
+    </w:p>
+    <w:p>
+      <w:pPr>
+        <w:ind w:left="720"/>
+        <w:rPr>
+          <w:lang w:val="es-CO"/>
+        </w:rPr>
+      </w:pPr>
+      <w:r>
+        <w:rPr>
+          <w:rFonts w:ascii="Courier New" w:eastAsia="Courier New" w:hAnsi="Courier New" w:cs="Courier New"/>
+          <w:sz w:val="20"/>
+          <w:szCs w:val="20"/>
+          <w:lang w:val="es-CO"/>
+        </w:rPr>
+        <w:t xml:space="preserve"> </w:t>
+      </w:r>
+    </w:p>
+    <w:p>
+      <w:pPr>
+        <w:ind w:left="720"/>
+        <w:rPr>
+          <w:lang w:val="es-CO"/>
+        </w:rPr>
+      </w:pPr>
+      <w:r>
+        <w:rPr>
+          <w:rFonts w:ascii="Courier New" w:eastAsia="Courier New" w:hAnsi="Courier New" w:cs="Courier New"/>
+          <w:sz w:val="20"/>
+          <w:szCs w:val="20"/>
+          <w:lang w:val="es-CO"/>
+        </w:rPr>
+        <w:t xml:space="preserve">    @abstractmethod</w:t>
+      </w:r>
+    </w:p>
+    <w:p>
+      <w:pPr>
+        <w:ind w:left="720"/>
+        <w:rPr>
+          <w:lang w:val="es-CO"/>
+        </w:rPr>
+      </w:pPr>
+      <w:r>
+        <w:rPr>
+          <w:rFonts w:ascii="Courier New" w:eastAsia="Courier New" w:hAnsi="Courier New" w:cs="Courier New"/>
+          <w:sz w:val="20"/>
+          <w:szCs w:val="20"/>
+          <w:lang w:val="es-CO"/>
+        </w:rPr>
+        <w:t xml:space="preserve">    def crear_formateador_reporte(self) -&gt; FormateadorReporte: ...</w:t>
+      </w:r>
+    </w:p>
+    <w:p>
+      <w:pPr>
+        <w:ind w:left="720"/>
+        <w:rPr>
+          <w:lang w:val="es-CO"/>
+        </w:rPr>
+      </w:pPr>
+      <w:r>
+        <w:rPr>
+          <w:rFonts w:ascii="Courier New" w:eastAsia="Courier New" w:hAnsi="Courier New" w:cs="Courier New"/>
+          <w:sz w:val="20"/>
+          <w:szCs w:val="20"/>
+          <w:lang w:val="es-CO"/>
+        </w:rPr>
+        <w:t xml:space="preserve"> </w:t>
+      </w:r>
+    </w:p>
+    <w:p>
+      <w:pPr>
+        <w:ind w:left="720"/>
+        <w:rPr>
+          <w:lang w:val="es-CO"/>
+        </w:rPr>
+      </w:pPr>
+      <w:r>
+        <w:rPr>
+          <w:rFonts w:ascii="Courier New" w:eastAsia="Courier New" w:hAnsi="Courier New" w:cs="Courier New"/>
+          <w:sz w:val="20"/>
+          <w:szCs w:val="20"/>
+          <w:lang w:val="es-CO"/>
+        </w:rPr>
+        <w:t xml:space="preserve"> </w:t>
+      </w:r>
+    </w:p>
+    <w:p>
+      <w:pPr>
+        <w:ind w:left="720"/>
+        <w:rPr>
+          <w:lang w:val="es-CO"/>
+        </w:rPr>
+      </w:pPr>
+      <w:r>
+        <w:rPr>
+          <w:rFonts w:ascii="Courier New" w:eastAsia="Courier New" w:hAnsi="Courier New" w:cs="Courier New"/>
+          <w:sz w:val="20"/>
+          <w:szCs w:val="20"/>
+          <w:lang w:val="es-CO"/>
+        </w:rPr>
+        <w:t xml:space="preserve">class CanalSMS(CanalNotificacionFactory):</w:t>
+      </w:r>
+    </w:p>
+    <w:p>
+      <w:pPr>
+        <w:ind w:left="720"/>
+        <w:rPr>
+          <w:lang w:val="es-CO"/>
+        </w:rPr>
+      </w:pPr>
+      <w:r>
+        <w:rPr>
+          <w:rFonts w:ascii="Courier New" w:eastAsia="Courier New" w:hAnsi="Courier New" w:cs="Courier New"/>
+          <w:sz w:val="20"/>
+          <w:szCs w:val="20"/>
+          <w:lang w:val="es-CO"/>
+        </w:rPr>
+        <w:t xml:space="preserve">    @property</w:t>
+      </w:r>
+    </w:p>
+    <w:p>
+      <w:pPr>
+        <w:ind w:left="720"/>
+        <w:rPr>
+          <w:lang w:val="es-CO"/>
+        </w:rPr>
+      </w:pPr>
+      <w:r>
+        <w:rPr>
+          <w:rFonts w:ascii="Courier New" w:eastAsia="Courier New" w:hAnsi="Courier New" w:cs="Courier New"/>
+          <w:sz w:val="20"/>
+          <w:szCs w:val="20"/>
+          <w:lang w:val="es-CO"/>
+        </w:rPr>
+        <w:t xml:space="preserve">    def canal(self) -&gt; str:</w:t>
+      </w:r>
+    </w:p>
+    <w:p>
+      <w:pPr>
+        <w:ind w:left="720"/>
+        <w:rPr>
+          <w:lang w:val="es-CO"/>
+        </w:rPr>
+      </w:pPr>
+      <w:r>
+        <w:rPr>
+          <w:rFonts w:ascii="Courier New" w:eastAsia="Courier New" w:hAnsi="Courier New" w:cs="Courier New"/>
+          <w:sz w:val="20"/>
+          <w:szCs w:val="20"/>
+          <w:lang w:val="es-CO"/>
+        </w:rPr>
+        <w:t xml:space="preserve">        return "sms"</w:t>
+      </w:r>
+    </w:p>
+    <w:p>
+      <w:pPr>
+        <w:ind w:left="720"/>
+        <w:rPr>
+          <w:lang w:val="es-CO"/>
+        </w:rPr>
+      </w:pPr>
+      <w:r>
+        <w:rPr>
+          <w:rFonts w:ascii="Courier New" w:eastAsia="Courier New" w:hAnsi="Courier New" w:cs="Courier New"/>
+          <w:sz w:val="20"/>
+          <w:szCs w:val="20"/>
+          <w:lang w:val="es-CO"/>
+        </w:rPr>
+        <w:t xml:space="preserve"> </w:t>
+      </w:r>
+    </w:p>
+    <w:p>
+      <w:pPr>
+        <w:ind w:left="720"/>
+        <w:rPr>
+          <w:lang w:val="es-CO"/>
+        </w:rPr>
+      </w:pPr>
+      <w:r>
+        <w:rPr>
+          <w:rFonts w:ascii="Courier New" w:eastAsia="Courier New" w:hAnsi="Courier New" w:cs="Courier New"/>
+          <w:sz w:val="20"/>
+          <w:szCs w:val="20"/>
+          <w:lang w:val="es-CO"/>
+        </w:rPr>
+        <w:t xml:space="preserve">    def crear_notificador_transaccion(self) -&gt; NotificadorTransaccion:</w:t>
+      </w:r>
+    </w:p>
+    <w:p>
+      <w:pPr>
+        <w:ind w:left="720"/>
+        <w:rPr>
+          <w:lang w:val="es-CO"/>
+        </w:rPr>
+      </w:pPr>
+      <w:r>
+        <w:rPr>
+          <w:rFonts w:ascii="Courier New" w:eastAsia="Courier New" w:hAnsi="Courier New" w:cs="Courier New"/>
+          <w:sz w:val="20"/>
+          <w:szCs w:val="20"/>
+          <w:lang w:val="es-CO"/>
+        </w:rPr>
+        <w:t xml:space="preserve">        return _TransaccionSMS()</w:t>
+      </w:r>
+    </w:p>
+    <w:p>
+      <w:pPr>
+        <w:ind w:left="720"/>
+        <w:rPr>
+          <w:lang w:val="es-CO"/>
+        </w:rPr>
+      </w:pPr>
+      <w:r>
+        <w:rPr>
+          <w:rFonts w:ascii="Courier New" w:eastAsia="Courier New" w:hAnsi="Courier New" w:cs="Courier New"/>
+          <w:sz w:val="20"/>
+          <w:szCs w:val="20"/>
+          <w:lang w:val="es-CO"/>
+        </w:rPr>
+        <w:t xml:space="preserve">    # ... crea también _AlertaSMS() y _ReporteSMS()</w:t>
+      </w:r>
+    </w:p>
+    <w:p>
+      <w:pPr>
+        <w:spacing w:before="120" w:line="480" w:lineRule="auto"/>
+        <w:rPr>
+          <w:lang w:val="es-CO"/>
+        </w:rPr>
+      </w:pPr>
+      <w:r>
+        <w:rPr>
+          <w:i/>
+          <w:iCs/>
+          <w:lang w:val="es-CO"/>
+        </w:rPr>
+        <w:t xml:space="preserve">Nota. </w:t>
+      </w:r>
+      <w:r>
+        <w:rPr>
+          <w:lang w:val="es-CO"/>
+        </w:rPr>
+        <w:t xml:space="preserve">Extracto de backend/notificaciones.py. Cada método abstracto de la fábrica es implementado por las tres fábricas concretas (CanalEmail, CanalSMS y CanalPush); el cliente ServicioNotificaciones solo depende de la interfaz CanalNotificacionFactory, nunca de una clase concreta.</w:t>
+      </w:r>
+    </w:p>
+    <w:p>
+      <w:pPr>
+        <w:pStyle w:val="Ttulo3"/>
+        <w:spacing w:before="200" w:after="100" w:line="480" w:lineRule="auto"/>
+        <w:rPr>
+          <w:lang w:val="es-CO"/>
+        </w:rPr>
+      </w:pPr>
+      <w:bookmarkStart w:id="33" w:name="bm_abstract_gana"/>
+      <w:r>
+        <w:rPr>
+          <w:b/>
+          <w:bCs/>
+          <w:i/>
+          <w:iCs/>
+          <w:color w:val="000000"/>
+          <w:lang w:val="es-CO"/>
+        </w:rPr>
+        <w:t xml:space="preserve">Qué Gana la Plataforma con Esto</w:t>
+      </w:r>
+      <w:bookmarkEnd w:id="33"/>
+    </w:p>
+    <w:p>
+      <w:pPr>
+        <w:spacing w:line="480" w:lineRule="auto"/>
+        <w:jc w:val="both"/>
+        <w:rPr>
+          <w:lang w:val="es-CO"/>
+        </w:rPr>
+      </w:pPr>
+      <w:r>
+        <w:rPr>
+          <w:b/>
+          <w:bCs/>
+          <w:lang w:val="es-CO"/>
+        </w:rPr>
+        <w:t xml:space="preserve">Coherencia garantizada por construcción. </w:t>
+      </w:r>
+      <w:r>
+        <w:rPr>
+          <w:lang w:val="es-CO"/>
+        </w:rPr>
+        <w:t xml:space="preserve">Al seleccionar un canal, los tres tipos de aviso se generan con las mismas reglas de formato. Resulta imposible obtener un SMS con asunto o una notificación push sin payload, porque cada fábrica solo sabe fabricar piezas de su propia familia.</w:t>
+      </w:r>
+    </w:p>
+    <w:p>
+      <w:pPr>
+        <w:spacing w:line="480" w:lineRule="auto"/>
+        <w:jc w:val="both"/>
+        <w:rPr>
+          <w:lang w:val="es-CO"/>
+        </w:rPr>
+      </w:pPr>
+      <w:r>
+        <w:rPr>
+          <w:b/>
+          <w:bCs/>
+          <w:lang w:val="es-CO"/>
+        </w:rPr>
+        <w:t xml:space="preserve">Un único punto de decisión del canal. </w:t>
+      </w:r>
+      <w:r>
+        <w:rPr>
+          <w:lang w:val="es-CO"/>
+        </w:rPr>
+        <w:t xml:space="preserve">La preferencia del usuario (canal_notificacion) se resuelve una sola vez, cuando PlataformaEnergia crea el servicio con _servicio_notificaciones(usuario_id), y no en cada lugar que envía un aviso.</w:t>
+      </w:r>
+    </w:p>
+    <w:p>
+      <w:pPr>
+        <w:spacing w:line="480" w:lineRule="auto"/>
+        <w:jc w:val="both"/>
+        <w:rPr>
+          <w:lang w:val="es-CO"/>
+        </w:rPr>
+      </w:pPr>
+      <w:r>
+        <w:rPr>
+          <w:b/>
+          <w:bCs/>
+          <w:lang w:val="es-CO"/>
+        </w:rPr>
+        <w:t xml:space="preserve">Extensibilidad sin modificar lo existente. </w:t>
+      </w:r>
+      <w:r>
+        <w:rPr>
+          <w:lang w:val="es-CO"/>
+        </w:rPr>
+        <w:t xml:space="preserve">Incorporar un canal nuevo —WhatsApp, Telegram o un webhook— consiste en crear una fábrica concreta más y registrarla; el código que emite avisos (ejecutar_subasta, enviar_lectura_iot, generar_reporte) no cambia. La prueba automatizada A-17 lo demuestra con un CanalWebhook definido dentro del propio test.</w:t>
+      </w:r>
+    </w:p>
+    <w:p>
+      <w:pPr>
+        <w:spacing w:line="480" w:lineRule="auto"/>
+        <w:jc w:val="both"/>
+        <w:rPr>
+          <w:lang w:val="es-CO"/>
+        </w:rPr>
+      </w:pPr>
+      <w:r>
+        <w:rPr>
+          <w:b/>
+          <w:bCs/>
+          <w:lang w:val="es-CO"/>
+        </w:rPr>
+        <w:t xml:space="preserve">Relación con el Factory Method del proyecto. </w:t>
+      </w:r>
+      <w:r>
+        <w:rPr>
+          <w:lang w:val="es-CO"/>
+        </w:rPr>
+        <w:t xml:space="preserve">Mientras que el Factory Method crea un único producto (un DispositivoIoT), el Abstract Factory crea una familia de productos relacionados que deben usarse juntos: los tres notificadores de un mismo canal.</w:t>
+      </w:r>
+    </w:p>
+    <w:p>
+      <w:pPr>
+        <w:pStyle w:val="Ttulo3"/>
+        <w:spacing w:before="200" w:after="100" w:line="480" w:lineRule="auto"/>
+        <w:rPr>
+          <w:lang w:val="es-CO"/>
+        </w:rPr>
+      </w:pPr>
+      <w:bookmarkStart w:id="34" w:name="bm_abstract_justificacion"/>
+      <w:r>
+        <w:rPr>
+          <w:b/>
+          <w:bCs/>
+          <w:i/>
+          <w:iCs/>
+          <w:color w:val="000000"/>
+          <w:lang w:val="es-CO"/>
+        </w:rPr>
+        <w:t xml:space="preserve">Justificación de su Uso en el Proyecto</w:t>
+      </w:r>
+      <w:bookmarkEnd w:id="34"/>
+    </w:p>
+    <w:p>
+      <w:pPr>
+        <w:spacing w:line="480" w:lineRule="auto"/>
+        <w:jc w:val="both"/>
+        <w:rPr>
+          <w:lang w:val="es-CO"/>
+        </w:rPr>
+      </w:pPr>
+      <w:r>
+        <w:rPr>
+          <w:lang w:val="es-CO"/>
+        </w:rPr>
+        <w:t xml:space="preserve">El patrón Abstract Factory resulta pertinente para este proyecto porque, según lo planteado en la Contextualización del Proyecto, la plataforma debe mantener informados a productores y consumidores sobre la actividad del mercado en tiempo real y sobre el estado de sus dispositivos. Esa comunicación es transversal a varias funcionalidades —subastas, monitoreo IoT y reportes— y multiplataforma por naturaleza, ya que los usuarios interactúan desde distintos dispositivos y prefieren distintos medios. Agrupar los notificadores por canal en una fábrica evita que la lógica de negocio conozca los detalles de cada medio y permite que la plataforma evolucione hacia nuevos canales sin arriesgar la coherencia de los mensajes existentes, en línea con el principio abierto/cerrado.</w:t>
+      </w:r>
+    </w:p>
+    <w:p>
+      <w:pPr>
+        <w:pStyle w:val="Ttulo3"/>
+        <w:spacing w:before="200" w:after="100" w:line="480" w:lineRule="auto"/>
+        <w:rPr>
+          <w:lang w:val="es-CO"/>
+        </w:rPr>
+      </w:pPr>
+      <w:bookmarkStart w:id="35" w:name="bm_abstract_validacion"/>
+      <w:r>
+        <w:rPr>
+          <w:b/>
+          <w:bCs/>
+          <w:i/>
+          <w:iCs/>
+          <w:color w:val="000000"/>
+          <w:lang w:val="es-CO"/>
+        </w:rPr>
+        <w:t xml:space="preserve">Validación del Patrón</w:t>
+      </w:r>
+      <w:bookmarkEnd w:id="35"/>
+    </w:p>
+    <w:p>
+      <w:pPr>
+        <w:spacing w:line="480" w:lineRule="auto"/>
+        <w:jc w:val="both"/>
+        <w:rPr>
+          <w:lang w:val="es-CO"/>
+        </w:rPr>
+      </w:pPr>
+      <w:r>
+        <w:rPr>
+          <w:lang w:val="es-CO"/>
+        </w:rPr>
+        <w:t xml:space="preserve">La validación del patrón Abstract Factory se realizó mediante pruebas unitarias automatizadas con pytest, que verifican que el código cliente nunca instancia notificadores concretos, que cada fábrica de canal construye la familia completa (transacción, alerta IoT y reporte) y que todos los mensajes de un mismo servicio salen por el mismo canal respetando sus restricciones de formato. Como se observa en la Figura 9, la suite Patrones/abstract_factory ejecutó 27 casos, todos superados, y el conjunto completo de pruebas del proyecto —Singleton, Factory Method y Abstract Factory— pasa sin errores.</w:t>
+      </w:r>
+    </w:p>
+    <w:p>
+      <w:pPr>
+        <w:spacing w:before="200" w:line="480" w:lineRule="auto"/>
+        <w:rPr>
+          <w:lang w:val="es-CO"/>
+        </w:rPr>
+      </w:pPr>
+      <w:bookmarkStart w:id="37" w:name="bm_fig9"/>
+      <w:r>
+        <w:rPr>
+          <w:b/>
+          <w:bCs/>
+          <w:lang w:val="es-CO"/>
+        </w:rPr>
+        <w:t xml:space="preserve">Figura 9</w:t>
+      </w:r>
+      <w:bookmarkEnd w:id="37"/>
+    </w:p>
+    <w:p>
+      <w:pPr>
+        <w:spacing w:line="480" w:lineRule="auto"/>
+        <w:rPr>
+          <w:lang w:val="es-CO"/>
+        </w:rPr>
+      </w:pPr>
+      <w:r>
+        <w:rPr>
+          <w:i/>
+          <w:iCs/>
+          <w:lang w:val="es-CO"/>
+        </w:rPr>
+        <w:t xml:space="preserve">Resultados de la ejecución de las pruebas unitarias del patrón Abstract Factory</w:t>
+      </w:r>
+    </w:p>
+    <w:p>
+      <w:pPr>
+        <w:spacing w:before="120" w:after="120"/>
+        <w:jc w:val="center"/>
+        <w:rPr>
+          <w:lang w:val="es-CO"/>
+        </w:rPr>
+      </w:pPr>
+      <w:r>
+        <w:rPr>
+          <w:i/>
+          <w:iCs/>
+          <w:color w:val="808080"/>
+          <w:lang w:val="es-CO"/>
+        </w:rPr>
+        <w:t xml:space="preserve">[ Insertar aquí la captura de pantalla ]</w:t>
+      </w:r>
+    </w:p>
+    <w:p>
+      <w:pPr>
+        <w:spacing w:before="120" w:line="480" w:lineRule="auto"/>
+        <w:rPr>
+          <w:lang w:val="es-CO"/>
+        </w:rPr>
+      </w:pPr>
+      <w:r>
+        <w:rPr>
+          <w:i/>
+          <w:iCs/>
+          <w:lang w:val="es-CO"/>
+        </w:rPr>
+        <w:t xml:space="preserve">Nota. </w:t>
+      </w:r>
+      <w:r>
+        <w:rPr>
+          <w:lang w:val="es-CO"/>
+        </w:rPr>
+        <w:t xml:space="preserve">Salida de consola de la ejecución de pytest sobre Patrones/abstract_factory/test_abstract_factory.py, mostrando la recolección y aprobación de los 27 casos (27 passed), agrupados por comportamiento: abstracciones no instanciables, resolución de la fábrica de canal, creación de la familia completa, coherencia de canal y reglas de formato por canal.</w:t>
+      </w:r>
+    </w:p>
+    <w:p>
+      <w:pPr>
+        <w:spacing w:line="480" w:lineRule="auto"/>
+        <w:jc w:val="both"/>
+        <w:rPr>
+          <w:lang w:val="es-CO"/>
+        </w:rPr>
+      </w:pPr>
+      <w:r>
+        <w:rPr>
+          <w:lang w:val="es-CO"/>
+        </w:rPr>
+        <w:t xml:space="preserve">Además de las pruebas unitarias, el funcionamiento del patrón se validó de manera funcional a través de la API y de la interfaz. La Figura 10 muestra la documentación interactiva (Swagger) de FastAPI con los endpoints de notificaciones —GET /notificaciones, GET /notificaciones/canales, PUT /usuarios/me/canal y POST /reportes/generar—, que internamente invocan crear_servicio(canal) para construir la familia de avisos del usuario.</w:t>
+      </w:r>
+    </w:p>
+    <w:p>
+      <w:pPr>
+        <w:spacing w:before="200" w:line="480" w:lineRule="auto"/>
+        <w:rPr>
+          <w:lang w:val="es-CO"/>
+        </w:rPr>
+      </w:pPr>
+      <w:bookmarkStart w:id="38" w:name="bm_fig10"/>
+      <w:r>
+        <w:rPr>
+          <w:b/>
+          <w:bCs/>
+          <w:lang w:val="es-CO"/>
+        </w:rPr>
+        <w:t xml:space="preserve">Figura 10</w:t>
+      </w:r>
+      <w:bookmarkEnd w:id="38"/>
+    </w:p>
+    <w:p>
+      <w:pPr>
+        <w:spacing w:line="480" w:lineRule="auto"/>
+        <w:rPr>
+          <w:lang w:val="es-CO"/>
+        </w:rPr>
+      </w:pPr>
+      <w:r>
+        <w:rPr>
+          <w:i/>
+          <w:iCs/>
+          <w:lang w:val="es-CO"/>
+        </w:rPr>
+        <w:t xml:space="preserve">Documentación interactiva (Swagger) de los endpoints de notificaciones de la API</w:t>
+      </w:r>
+    </w:p>
+    <w:p>
+      <w:pPr>
+        <w:spacing w:before="120" w:after="120"/>
+        <w:jc w:val="center"/>
+        <w:rPr>
+          <w:lang w:val="es-CO"/>
+        </w:rPr>
+      </w:pPr>
+      <w:r>
+        <w:rPr>
+          <w:i/>
+          <w:iCs/>
+          <w:color w:val="808080"/>
+          <w:lang w:val="es-CO"/>
+        </w:rPr>
+        <w:t xml:space="preserve">[ Insertar aquí la captura de pantalla ]</w:t>
+      </w:r>
+    </w:p>
+    <w:p>
+      <w:pPr>
+        <w:spacing w:before="120" w:line="480" w:lineRule="auto"/>
+        <w:rPr>
+          <w:lang w:val="es-CO"/>
+        </w:rPr>
+      </w:pPr>
+      <w:r>
+        <w:rPr>
+          <w:i/>
+          <w:iCs/>
+          <w:lang w:val="es-CO"/>
+        </w:rPr>
+        <w:t xml:space="preserve">Nota. </w:t>
+      </w:r>
+      <w:r>
+        <w:rPr>
+          <w:lang w:val="es-CO"/>
+        </w:rPr>
+        <w:t xml:space="preserve">Vista de http://localhost:8000/docs con los endpoints relacionados con notificaciones y canales: la consulta de la bandeja del usuario, el listado de canales disponibles, el cambio de canal preferido y la generación del reporte energético.</w:t>
+      </w:r>
+    </w:p>
+    <w:p>
+      <w:pPr>
+        <w:spacing w:line="480" w:lineRule="auto"/>
+        <w:jc w:val="both"/>
+        <w:rPr>
+          <w:lang w:val="es-CO"/>
+        </w:rPr>
+      </w:pPr>
+      <w:r>
+        <w:rPr>
+          <w:lang w:val="es-CO"/>
+        </w:rPr>
+        <w:t xml:space="preserve">Por su parte, la Figura 11 evidencia el uso del patrón desde la interfaz de usuario: en la pestaña Notificaciones, un mismo evento —el cierre de una operación en la subasta— se presenta a cada usuario con el formato de su canal (un SMS breve sin asunto para quien eligió ese medio y una notificación push con payload para quien optó por la aplicación móvil). Es la fábrica de canal seleccionada según canal_notificacion la que determina, en tiempo de ejecución, qué familia de notificadores construye los mensajes.</w:t>
+      </w:r>
+    </w:p>
+    <w:p>
+      <w:pPr>
+        <w:spacing w:before="200" w:line="480" w:lineRule="auto"/>
+        <w:rPr>
+          <w:lang w:val="es-CO"/>
+        </w:rPr>
+      </w:pPr>
+      <w:bookmarkStart w:id="39" w:name="bm_fig11"/>
+      <w:r>
+        <w:rPr>
+          <w:b/>
+          <w:bCs/>
+          <w:lang w:val="es-CO"/>
+        </w:rPr>
+        <w:t xml:space="preserve">Figura 11</w:t>
+      </w:r>
+      <w:bookmarkEnd w:id="39"/>
+    </w:p>
+    <w:p>
+      <w:pPr>
+        <w:spacing w:line="480" w:lineRule="auto"/>
+        <w:rPr>
+          <w:lang w:val="es-CO"/>
+        </w:rPr>
+      </w:pPr>
+      <w:r>
+        <w:rPr>
+          <w:i/>
+          <w:iCs/>
+          <w:lang w:val="es-CO"/>
+        </w:rPr>
+        <w:t xml:space="preserve">Interfaz de la plataforma mostrando un mismo aviso con el formato de cada canal</w:t>
+      </w:r>
+    </w:p>
+    <w:p>
+      <w:pPr>
+        <w:spacing w:before="120" w:after="120"/>
+        <w:jc w:val="center"/>
+        <w:rPr>
+          <w:lang w:val="es-CO"/>
+        </w:rPr>
+      </w:pPr>
+      <w:r>
+        <w:rPr>
+          <w:i/>
+          <w:iCs/>
+          <w:color w:val="808080"/>
+          <w:lang w:val="es-CO"/>
+        </w:rPr>
+        <w:t xml:space="preserve">[ Insertar aquí la captura de pantalla ]</w:t>
+      </w:r>
+    </w:p>
+    <w:p>
+      <w:pPr>
+        <w:spacing w:before="120" w:line="480" w:lineRule="auto"/>
+        <w:rPr>
+          <w:lang w:val="es-CO"/>
+        </w:rPr>
+      </w:pPr>
+      <w:r>
+        <w:rPr>
+          <w:i/>
+          <w:iCs/>
+          <w:lang w:val="es-CO"/>
+        </w:rPr>
+        <w:t xml:space="preserve">Nota. </w:t>
+      </w:r>
+      <w:r>
+        <w:rPr>
+          <w:lang w:val="es-CO"/>
+        </w:rPr>
+        <w:t xml:space="preserve">Pestaña Notificaciones de la plataforma Voltia: la bandeja de la usuaria con canal push muestra el aviso con título y cuerpo cortos, mientras que la del usuario con canal SMS muestra el mismo evento como un texto plano de hasta 160 caracteres, sin asunto.</w:t>
+      </w:r>
+    </w:p>
+    <w:p>
+      <w:pPr>
+        <w:pStyle w:val="Ttulo3"/>
+        <w:spacing w:before="200" w:after="100" w:line="480" w:lineRule="auto"/>
+        <w:rPr>
+          <w:lang w:val="es-CO"/>
+        </w:rPr>
+      </w:pPr>
+      <w:bookmarkStart w:id="27" w:name="bm_factory_conclusion"/>
+      <w:r>
+        <w:rPr>
+          <w:b/>
+          <w:bCs/>
+          <w:i/>
+          <w:iCs/>
+          <w:color w:val="000000"/>
+          <w:lang w:val="es-CO"/>
+        </w:rPr>
         <w:lastRenderedPageBreak/>
         <w:t>Conclusión</w:t>
       </w:r>
@@ -7259,21 +9052,19 @@
         <w:rPr>
           <w:lang w:val="es-CO"/>
         </w:rPr>
-        <w:t xml:space="preserve">En resumen, el patrón Singleton garantiza que toda la plataforma comparta el mismo estado, mientras que el Factory Method garantiza que cada tipo de dispositivo </w:t>
-      </w:r>
-      <w:proofErr w:type="spellStart"/>
-      <w:r>
-        <w:rPr>
-          <w:lang w:val="es-CO"/>
-        </w:rPr>
-        <w:t>IoT</w:t>
-      </w:r>
-      <w:proofErr w:type="spellEnd"/>
-      <w:r>
-        <w:rPr>
-          <w:lang w:val="es-CO"/>
-        </w:rPr>
-        <w:t xml:space="preserve"> se cree y se comporte correctamente sin acoplar ese conocimiento al resto del sistema. Ambos patrones son complementarios: el primero define cuántas instancias de la plataforma existen, y el segundo define cómo se crean los objetos que la plataforma administra.</w:t>
+        <w:t>En resumen, el patrón Singleton garantiza que toda la plataforma comparta un mismo estado consistente, el Factory Method garantiza que cada tipo de dispositivo IoT se cree y se comporte correctamente sin acoplar ese conocimiento al resto del sistema, y el Abstract Factory garantiza que cada canal de notificación genere la familia completa de avisos con un formato coherente. Los tres patrones son complementarios: el primero define cuántas instancias de la plataforma existen, el segundo define cómo se crean los objetos individuales que la plataforma administra y el tercero define cómo se crean familias de objetos que deben usarse en conjunto.</w:t>
+      </w:r>
+      <w:proofErr w:type="spellStart"/>
+      <w:r>
+        <w:rPr>
+          <w:lang w:val="es-CO"/>
+        </w:rPr>
+      </w:r>
+      <w:proofErr w:type="spellEnd"/>
+      <w:r>
+        <w:rPr>
+          <w:lang w:val="es-CO"/>
+        </w:rPr>
       </w:r>
     </w:p>
     <w:p>
@@ -7376,6 +9167,35 @@
       <w:proofErr w:type="spellEnd"/>
       <w:r>
         <w:t xml:space="preserve"> 2026, de https://refactoring.guru/es/design-patterns/factory-method</w:t>
+      </w:r>
+    </w:p>
+    <w:p>
+      <w:pPr>
+        <w:spacing w:line="480" w:lineRule="auto"/>
+        <w:ind w:left="720" w:hanging="720"/>
+        <w:rPr>
+          <w:lang w:val="es-CO"/>
+        </w:rPr>
+      </w:pPr>
+      <w:r>
+        <w:rPr>
+          <w:lang w:val="es-CO"/>
+        </w:rPr>
+        <w:t xml:space="preserve">Refactoring.Guru. (s.f.). </w:t>
+      </w:r>
+      <w:r>
+        <w:rPr>
+          <w:i/>
+          <w:iCs/>
+          <w:lang w:val="es-CO"/>
+        </w:rPr>
+        <w:t>Abstract Factory.</w:t>
+      </w:r>
+      <w:r>
+        <w:rPr>
+          <w:lang w:val="es-CO"/>
+        </w:rPr>
+        <w:t xml:space="preserve"> Recuperado en 2026, de https://refactoring.guru/es/design-patterns/abstract-factory</w:t>
       </w:r>
     </w:p>
     <w:sectPr>

</xml_diff>